<commit_message>
docs: eliminar duplicados (kickoff, gantt, roadmap, hitos); solo memoria central
Co-authored-by: Cursor <cursoragent@cursor.com>
</commit_message>
<xml_diff>
--- a/docs/Memoria-tecnica-Uber-Truck.docx
+++ b/docs/Memoria-tecnica-Uber-Truck.docx
@@ -17,6 +17,31 @@
     </w:p>
     <w:p>
       <w:pPr>
+        <w:spacing w:lineRule="auto"/>
+      </w:pPr>
+      <w:hyperlink r:id="rId6">
+        <w:r>
+          <w:rPr>
+            <w:rStyle w:val="Hyperlink"/>
+          </w:rPr>
+          <w:t xml:space="preserve">← Índice documentación</w:t>
+        </w:r>
+      </w:hyperlink>
+      <w:r>
+        <w:rPr/>
+        <w:t xml:space="preserve"> · </w:t>
+      </w:r>
+      <w:hyperlink r:id="rId7">
+        <w:r>
+          <w:rPr>
+            <w:rStyle w:val="Hyperlink"/>
+          </w:rPr>
+          <w:t xml:space="preserve">Inicio app</w:t>
+        </w:r>
+      </w:hyperlink>
+    </w:p>
+    <w:p>
+      <w:pPr>
         <w:pStyle w:val="Heading1"/>
         <w:spacing w:lineRule="auto"/>
       </w:pPr>
@@ -52,7 +77,22 @@
       </w:r>
       <w:r>
         <w:rPr/>
-        <w:t xml:space="preserve"> 1.0 · mayo 2026</w:t>
+        <w:t xml:space="preserve"> 2.1 · mayo 2026 (estructura alineada a Chanchi: Parte I + Parte II)</w:t>
+      </w:r>
+    </w:p>
+    <w:p>
+      <w:pPr>
+        <w:spacing w:lineRule="auto"/>
+      </w:pPr>
+      <w:r>
+        <w:rPr>
+          <w:b/>
+        </w:rPr>
+        <w:t xml:space="preserve">Versión software:</w:t>
+      </w:r>
+      <w:r>
+        <w:rPr/>
+        <w:t xml:space="preserve"> 0.0.19</w:t>
       </w:r>
     </w:p>
     <w:p>
@@ -67,7 +107,121 @@
       </w:r>
       <w:r>
         <w:rPr/>
-        <w:t xml:space="preserve"> Kickoff + skeleton Express; MVP digital en diseño</w:t>
+        <w:t xml:space="preserve"> MVP digital en producción (Railway) — adelanto vs Gantt oct 2026</w:t>
+      </w:r>
+    </w:p>
+    <w:p>
+      <w:pPr>
+        <w:spacing w:lineRule="auto"/>
+      </w:pPr>
+      <w:r>
+        <w:rPr>
+          <w:b/>
+        </w:rPr>
+        <w:t xml:space="preserve">Producción:</w:t>
+      </w:r>
+      <w:hyperlink r:id="rId8">
+        <w:r>
+          <w:rPr>
+            <w:rStyle w:val="Hyperlink"/>
+          </w:rPr>
+          <w:t xml:space="preserve">uber-truck-production.up.railway.app</w:t>
+        </w:r>
+      </w:hyperlink>
+    </w:p>
+    <w:p>
+      <w:pPr>
+        <w:spacing w:lineRule="auto"/>
+      </w:pPr>
+      <w:r>
+        <w:rPr>
+          <w:b/>
+        </w:rPr>
+        <w:t xml:space="preserve">Markdown vivo:</w:t>
+      </w:r>
+      <w:r>
+        <w:rPr/>
+        <w:t xml:space="preserve">docs/01-MEMORIA-TECNICA.md</w:t>
+      </w:r>
+      <w:r>
+        <w:rPr/>
+        <w:t xml:space="preserve"> · </w:t>
+      </w:r>
+      <w:r>
+        <w:rPr>
+          <w:b/>
+        </w:rPr>
+        <w:t xml:space="preserve">Hub:</w:t>
+      </w:r>
+      <w:hyperlink r:id="rId9">
+        <w:r>
+          <w:rPr>
+            <w:rStyle w:val="Hyperlink"/>
+          </w:rPr>
+          <w:t xml:space="preserve">docs/index.html</w:t>
+        </w:r>
+      </w:hyperlink>
+      <w:r>
+        <w:rPr/>
+        <w:t xml:space="preserve"> · </w:t>
+      </w:r>
+      <w:r>
+        <w:rPr>
+          <w:b/>
+        </w:rPr>
+        <w:t xml:space="preserve">Bitácora hito:</w:t>
+      </w:r>
+      <w:r>
+        <w:rPr/>
+        <w:t xml:space="preserve">docs/HITO-DIGITAL-MVP.md</w:t>
+      </w:r>
+    </w:p>
+    <w:p>
+      <w:pPr>
+        <w:spacing w:lineRule="auto"/>
+      </w:pPr>
+      <w:r>
+        <w:rPr>
+          <w:b/>
+        </w:rPr>
+        <w:t xml:space="preserve">Canvas (Cursor):</w:t>
+      </w:r>
+      <w:r>
+        <w:rPr/>
+        <w:t xml:space="preserve">canvases/estado-avance.canvas.tsx</w:t>
+      </w:r>
+    </w:p>
+    <w:p>
+      <w:pPr>
+        <w:spacing w:lineRule="auto"/>
+      </w:pPr>
+      <w:r>
+        <w:rPr>
+          <w:b/>
+        </w:rPr>
+        <w:t xml:space="preserve">SQL Supabase:</w:t>
+      </w:r>
+      <w:r>
+        <w:rPr/>
+        <w:t xml:space="preserve">docs/SQL-SUPABASE.md</w:t>
+      </w:r>
+      <w:r>
+        <w:rPr/>
+        <w:t xml:space="preserve"> · </w:t>
+      </w:r>
+      <w:r>
+        <w:rPr/>
+        <w:t xml:space="preserve">supabase/migrations/RUN_PENDING.sql</w:t>
+      </w:r>
+    </w:p>
+    <w:p>
+      <w:pPr>
+        <w:pStyle w:val="Heading1"/>
+        <w:spacing w:lineRule="auto"/>
+      </w:pPr>
+      <w:r>
+        <w:rPr/>
+        <w:t xml:space="preserve">Parte II — Arquitectura y stack</w:t>
       </w:r>
     </w:p>
     <w:p>
@@ -2138,7 +2292,2513 @@
       </w:pPr>
       <w:r>
         <w:rPr/>
-        <w:t xml:space="preserve">11. Referencias</w:t>
+        <w:t xml:space="preserve">11. Referencias y documentación</w:t>
+      </w:r>
+    </w:p>
+    <w:tbl>
+      <w:tblPr>
+        <w:tblBorders>
+          <w:top w:val="single" w:sz="1" w:space="0" w:color="000000"/>
+          <w:bottom w:val="single" w:sz="1" w:space="0" w:color="000000"/>
+          <w:left w:val="single" w:sz="1" w:space="0" w:color="000000"/>
+          <w:right w:val="single" w:sz="1" w:space="0" w:color="000000"/>
+        </w:tblBorders>
+        <w:tblCellSpacing w:w="0" w:type="dxa"/>
+        <w:tblCellMar>
+          <w:top w:type="dxa" w:w="80"/>
+          <w:bottom w:type="dxa" w:w="80"/>
+          <w:left w:type="dxa" w:w="160"/>
+          <w:right w:type="dxa" w:w="160"/>
+        </w:tblCellMar>
+        <w:jc w:val="center"/>
+      </w:tblPr>
+      <w:tblGrid>
+        <w:gridCol w:w="4320"/>
+        <w:gridCol w:w="4320"/>
+      </w:tblGrid>
+      <w:tr>
+        <w:trPr/>
+        <w:tc>
+          <w:tcPr>
+            <w:tcBorders>
+              <w:top w:val="single" w:sz="1" w:space="0" w:color="000000"/>
+              <w:bottom w:val="single" w:sz="1" w:space="0" w:color="000000"/>
+              <w:left w:val="single" w:sz="1" w:space="0" w:color="000000"/>
+              <w:right w:val="single" w:sz="1" w:space="0" w:color="000000"/>
+            </w:tcBorders>
+          </w:tcPr>
+          <w:p>
+            <w:pPr>
+              <w:spacing w:lineRule="auto"/>
+            </w:pPr>
+            <w:r>
+              <w:rPr/>
+              <w:t xml:space="preserve">Documento</w:t>
+            </w:r>
+          </w:p>
+        </w:tc>
+        <w:tc>
+          <w:tcPr>
+            <w:tcBorders>
+              <w:top w:val="single" w:sz="1" w:space="0" w:color="000000"/>
+              <w:bottom w:val="single" w:sz="1" w:space="0" w:color="000000"/>
+              <w:left w:val="single" w:sz="1" w:space="0" w:color="000000"/>
+              <w:right w:val="single" w:sz="1" w:space="0" w:color="000000"/>
+            </w:tcBorders>
+          </w:tcPr>
+          <w:p>
+            <w:pPr>
+              <w:spacing w:lineRule="auto"/>
+            </w:pPr>
+            <w:r>
+              <w:rPr/>
+              <w:t xml:space="preserve">Ruta</w:t>
+            </w:r>
+          </w:p>
+        </w:tc>
+      </w:tr>
+      <w:tr>
+        <w:trPr/>
+        <w:tc>
+          <w:tcPr>
+            <w:tcBorders>
+              <w:top w:val="single" w:sz="1" w:space="0" w:color="000000"/>
+              <w:bottom w:val="single" w:sz="1" w:space="0" w:color="000000"/>
+              <w:left w:val="single" w:sz="1" w:space="0" w:color="000000"/>
+              <w:right w:val="single" w:sz="1" w:space="0" w:color="000000"/>
+            </w:tcBorders>
+          </w:tcPr>
+          <w:p>
+            <w:pPr>
+              <w:spacing w:lineRule="auto"/>
+            </w:pPr>
+            <w:r>
+              <w:rPr/>
+              <w:t xml:space="preserve">Índice maestro</w:t>
+            </w:r>
+          </w:p>
+        </w:tc>
+        <w:tc>
+          <w:tcPr>
+            <w:tcBorders>
+              <w:top w:val="single" w:sz="1" w:space="0" w:color="000000"/>
+              <w:bottom w:val="single" w:sz="1" w:space="0" w:color="000000"/>
+              <w:left w:val="single" w:sz="1" w:space="0" w:color="000000"/>
+              <w:right w:val="single" w:sz="1" w:space="0" w:color="000000"/>
+            </w:tcBorders>
+          </w:tcPr>
+          <w:p>
+            <w:pPr>
+              <w:spacing w:lineRule="auto"/>
+            </w:pPr>
+            <w:r>
+              <w:rPr/>
+              <w:t xml:space="preserve">docs/00-INDICE-DOCUMENTACION.md</w:t>
+            </w:r>
+          </w:p>
+        </w:tc>
+      </w:tr>
+      <w:tr>
+        <w:trPr/>
+        <w:tc>
+          <w:tcPr>
+            <w:tcBorders>
+              <w:top w:val="single" w:sz="1" w:space="0" w:color="000000"/>
+              <w:bottom w:val="single" w:sz="1" w:space="0" w:color="000000"/>
+              <w:left w:val="single" w:sz="1" w:space="0" w:color="000000"/>
+              <w:right w:val="single" w:sz="1" w:space="0" w:color="000000"/>
+            </w:tcBorders>
+          </w:tcPr>
+          <w:p>
+            <w:pPr>
+              <w:spacing w:lineRule="auto"/>
+            </w:pPr>
+            <w:r>
+              <w:rPr/>
+              <w:t xml:space="preserve">Memoria técnica (MD)</w:t>
+            </w:r>
+          </w:p>
+        </w:tc>
+        <w:tc>
+          <w:tcPr>
+            <w:tcBorders>
+              <w:top w:val="single" w:sz="1" w:space="0" w:color="000000"/>
+              <w:bottom w:val="single" w:sz="1" w:space="0" w:color="000000"/>
+              <w:left w:val="single" w:sz="1" w:space="0" w:color="000000"/>
+              <w:right w:val="single" w:sz="1" w:space="0" w:color="000000"/>
+            </w:tcBorders>
+          </w:tcPr>
+          <w:p>
+            <w:pPr>
+              <w:spacing w:lineRule="auto"/>
+            </w:pPr>
+            <w:r>
+              <w:rPr/>
+              <w:t xml:space="preserve">docs/01-MEMORIA-TECNICA.md</w:t>
+            </w:r>
+          </w:p>
+        </w:tc>
+      </w:tr>
+      <w:tr>
+        <w:trPr/>
+        <w:tc>
+          <w:tcPr>
+            <w:tcBorders>
+              <w:top w:val="single" w:sz="1" w:space="0" w:color="000000"/>
+              <w:bottom w:val="single" w:sz="1" w:space="0" w:color="000000"/>
+              <w:left w:val="single" w:sz="1" w:space="0" w:color="000000"/>
+              <w:right w:val="single" w:sz="1" w:space="0" w:color="000000"/>
+            </w:tcBorders>
+          </w:tcPr>
+          <w:p>
+            <w:pPr>
+              <w:spacing w:lineRule="auto"/>
+            </w:pPr>
+            <w:r>
+              <w:rPr/>
+              <w:t xml:space="preserve">SQL completo</w:t>
+            </w:r>
+          </w:p>
+        </w:tc>
+        <w:tc>
+          <w:tcPr>
+            <w:tcBorders>
+              <w:top w:val="single" w:sz="1" w:space="0" w:color="000000"/>
+              <w:bottom w:val="single" w:sz="1" w:space="0" w:color="000000"/>
+              <w:left w:val="single" w:sz="1" w:space="0" w:color="000000"/>
+              <w:right w:val="single" w:sz="1" w:space="0" w:color="000000"/>
+            </w:tcBorders>
+          </w:tcPr>
+          <w:p>
+            <w:pPr>
+              <w:spacing w:lineRule="auto"/>
+            </w:pPr>
+            <w:r>
+              <w:rPr/>
+              <w:t xml:space="preserve">docs/SQL-SUPABASE.md</w:t>
+            </w:r>
+          </w:p>
+        </w:tc>
+      </w:tr>
+      <w:tr>
+        <w:trPr/>
+        <w:tc>
+          <w:tcPr>
+            <w:tcBorders>
+              <w:top w:val="single" w:sz="1" w:space="0" w:color="000000"/>
+              <w:bottom w:val="single" w:sz="1" w:space="0" w:color="000000"/>
+              <w:left w:val="single" w:sz="1" w:space="0" w:color="000000"/>
+              <w:right w:val="single" w:sz="1" w:space="0" w:color="000000"/>
+            </w:tcBorders>
+          </w:tcPr>
+          <w:p>
+            <w:pPr>
+              <w:spacing w:lineRule="auto"/>
+            </w:pPr>
+            <w:r>
+              <w:rPr/>
+              <w:t xml:space="preserve">Gantt detallado (HTML)</w:t>
+            </w:r>
+          </w:p>
+        </w:tc>
+        <w:tc>
+          <w:tcPr>
+            <w:tcBorders>
+              <w:top w:val="single" w:sz="1" w:space="0" w:color="000000"/>
+              <w:bottom w:val="single" w:sz="1" w:space="0" w:color="000000"/>
+              <w:left w:val="single" w:sz="1" w:space="0" w:color="000000"/>
+              <w:right w:val="single" w:sz="1" w:space="0" w:color="000000"/>
+            </w:tcBorders>
+          </w:tcPr>
+          <w:p>
+            <w:pPr>
+              <w:spacing w:lineRule="auto"/>
+            </w:pPr>
+            <w:r>
+              <w:rPr/>
+              <w:t xml:space="preserve">docs/Gantt-Uber-Truck.html</w:t>
+            </w:r>
+          </w:p>
+        </w:tc>
+      </w:tr>
+      <w:tr>
+        <w:trPr/>
+        <w:tc>
+          <w:tcPr>
+            <w:tcBorders>
+              <w:top w:val="single" w:sz="1" w:space="0" w:color="000000"/>
+              <w:bottom w:val="single" w:sz="1" w:space="0" w:color="000000"/>
+              <w:left w:val="single" w:sz="1" w:space="0" w:color="000000"/>
+              <w:right w:val="single" w:sz="1" w:space="0" w:color="000000"/>
+            </w:tcBorders>
+          </w:tcPr>
+          <w:p>
+            <w:pPr>
+              <w:spacing w:lineRule="auto"/>
+            </w:pPr>
+            <w:r>
+              <w:rPr/>
+              <w:t xml:space="preserve">Canvas estado avance</w:t>
+            </w:r>
+          </w:p>
+        </w:tc>
+        <w:tc>
+          <w:tcPr>
+            <w:tcBorders>
+              <w:top w:val="single" w:sz="1" w:space="0" w:color="000000"/>
+              <w:bottom w:val="single" w:sz="1" w:space="0" w:color="000000"/>
+              <w:left w:val="single" w:sz="1" w:space="0" w:color="000000"/>
+              <w:right w:val="single" w:sz="1" w:space="0" w:color="000000"/>
+            </w:tcBorders>
+          </w:tcPr>
+          <w:p>
+            <w:pPr>
+              <w:spacing w:lineRule="auto"/>
+            </w:pPr>
+            <w:r>
+              <w:rPr/>
+              <w:t xml:space="preserve">canvases/estado-avance.canvas.tsx</w:t>
+            </w:r>
+          </w:p>
+        </w:tc>
+      </w:tr>
+      <w:tr>
+        <w:trPr/>
+        <w:tc>
+          <w:tcPr>
+            <w:tcBorders>
+              <w:top w:val="single" w:sz="1" w:space="0" w:color="000000"/>
+              <w:bottom w:val="single" w:sz="1" w:space="0" w:color="000000"/>
+              <w:left w:val="single" w:sz="1" w:space="0" w:color="000000"/>
+              <w:right w:val="single" w:sz="1" w:space="0" w:color="000000"/>
+            </w:tcBorders>
+          </w:tcPr>
+          <w:p>
+            <w:pPr>
+              <w:spacing w:lineRule="auto"/>
+            </w:pPr>
+            <w:r>
+              <w:rPr/>
+              <w:t xml:space="preserve">Roadmap</w:t>
+            </w:r>
+          </w:p>
+        </w:tc>
+        <w:tc>
+          <w:tcPr>
+            <w:tcBorders>
+              <w:top w:val="single" w:sz="1" w:space="0" w:color="000000"/>
+              <w:bottom w:val="single" w:sz="1" w:space="0" w:color="000000"/>
+              <w:left w:val="single" w:sz="1" w:space="0" w:color="000000"/>
+              <w:right w:val="single" w:sz="1" w:space="0" w:color="000000"/>
+            </w:tcBorders>
+          </w:tcPr>
+          <w:p>
+            <w:pPr>
+              <w:spacing w:lineRule="auto"/>
+            </w:pPr>
+            <w:r>
+              <w:rPr/>
+              <w:t xml:space="preserve">docs/ROADMAP.md</w:t>
+            </w:r>
+          </w:p>
+        </w:tc>
+      </w:tr>
+      <w:tr>
+        <w:trPr/>
+        <w:tc>
+          <w:tcPr>
+            <w:tcBorders>
+              <w:top w:val="single" w:sz="1" w:space="0" w:color="000000"/>
+              <w:bottom w:val="single" w:sz="1" w:space="0" w:color="000000"/>
+              <w:left w:val="single" w:sz="1" w:space="0" w:color="000000"/>
+              <w:right w:val="single" w:sz="1" w:space="0" w:color="000000"/>
+            </w:tcBorders>
+          </w:tcPr>
+          <w:p>
+            <w:pPr>
+              <w:spacing w:lineRule="auto"/>
+            </w:pPr>
+            <w:r>
+              <w:rPr/>
+              <w:t xml:space="preserve">Política cancelación</w:t>
+            </w:r>
+          </w:p>
+        </w:tc>
+        <w:tc>
+          <w:tcPr>
+            <w:tcBorders>
+              <w:top w:val="single" w:sz="1" w:space="0" w:color="000000"/>
+              <w:bottom w:val="single" w:sz="1" w:space="0" w:color="000000"/>
+              <w:left w:val="single" w:sz="1" w:space="0" w:color="000000"/>
+              <w:right w:val="single" w:sz="1" w:space="0" w:color="000000"/>
+            </w:tcBorders>
+          </w:tcPr>
+          <w:p>
+            <w:pPr>
+              <w:spacing w:lineRule="auto"/>
+            </w:pPr>
+            <w:r>
+              <w:rPr/>
+              <w:t xml:space="preserve">docs/MATCH-CANCEL-POLICY.md</w:t>
+            </w:r>
+          </w:p>
+        </w:tc>
+      </w:tr>
+      <w:tr>
+        <w:trPr/>
+        <w:tc>
+          <w:tcPr>
+            <w:tcBorders>
+              <w:top w:val="single" w:sz="1" w:space="0" w:color="000000"/>
+              <w:bottom w:val="single" w:sz="1" w:space="0" w:color="000000"/>
+              <w:left w:val="single" w:sz="1" w:space="0" w:color="000000"/>
+              <w:right w:val="single" w:sz="1" w:space="0" w:color="000000"/>
+            </w:tcBorders>
+          </w:tcPr>
+          <w:p>
+            <w:pPr>
+              <w:spacing w:lineRule="auto"/>
+            </w:pPr>
+            <w:r>
+              <w:rPr/>
+              <w:t xml:space="preserve">Multas y cuenta bancaria</w:t>
+            </w:r>
+          </w:p>
+        </w:tc>
+        <w:tc>
+          <w:tcPr>
+            <w:tcBorders>
+              <w:top w:val="single" w:sz="1" w:space="0" w:color="000000"/>
+              <w:bottom w:val="single" w:sz="1" w:space="0" w:color="000000"/>
+              <w:left w:val="single" w:sz="1" w:space="0" w:color="000000"/>
+              <w:right w:val="single" w:sz="1" w:space="0" w:color="000000"/>
+            </w:tcBorders>
+          </w:tcPr>
+          <w:p>
+            <w:pPr>
+              <w:spacing w:lineRule="auto"/>
+            </w:pPr>
+            <w:r>
+              <w:rPr/>
+              <w:t xml:space="preserve">docs/PENALTIES-AND-ACCOUNTS.md</w:t>
+            </w:r>
+          </w:p>
+        </w:tc>
+      </w:tr>
+    </w:tbl>
+    <w:p>
+      <w:pPr>
+        <w:spacing w:lineRule="auto"/>
+      </w:pPr>
+      <w:r>
+        <w:rPr/>
+      </w:r>
+    </w:p>
+    <w:p>
+      <w:pPr>
+        <w:pStyle w:val="Heading1"/>
+        <w:spacing w:lineRule="auto"/>
+      </w:pPr>
+      <w:r>
+        <w:rPr/>
+        <w:t xml:space="preserve">Parte I — Hitos, Gantt y avance</w:t>
+      </w:r>
+    </w:p>
+    <w:p>
+      <w:pPr>
+        <w:spacing w:lineRule="auto"/>
+      </w:pPr>
+      <w:r>
+        <w:rPr/>
+        <w:t xml:space="preserve">Patrón equivalente a </w:t>
+      </w:r>
+      <w:r>
+        <w:rPr/>
+        <w:t xml:space="preserve">wa-fintech-mvp/docs/Memoria-tecnica-MVP-Fintech-IA.html</w:t>
+      </w:r>
+      <w:r>
+        <w:rPr/>
+        <w:t xml:space="preserve"> (Chanchi). Tabla detallada por mes: </w:t>
+      </w:r>
+      <w:hyperlink r:id="rId10">
+        <w:r>
+          <w:rPr>
+            <w:rStyle w:val="Hyperlink"/>
+          </w:rPr>
+          <w:t xml:space="preserve">Gantt-Uber-Truck.html</w:t>
+        </w:r>
+      </w:hyperlink>
+      <w:r>
+        <w:rPr/>
+        <w:t xml:space="preserve">. Backlog: </w:t>
+      </w:r>
+      <w:r>
+        <w:rPr/>
+        <w:t xml:space="preserve">docs/PROXIMOS-HITOS.md</w:t>
+      </w:r>
+      <w:r>
+        <w:rPr/>
+        <w:t xml:space="preserve">.</w:t>
+      </w:r>
+    </w:p>
+    <w:p>
+      <w:pPr>
+        <w:pStyle w:val="Heading3"/>
+        <w:spacing w:lineRule="auto"/>
+      </w:pPr>
+      <w:r>
+        <w:rPr/>
+        <w:t xml:space="preserve">Leyenda Gantt</w:t>
+      </w:r>
+    </w:p>
+    <w:tbl>
+      <w:tblPr>
+        <w:tblBorders>
+          <w:top w:val="single" w:sz="2" w:space="0" w:color="000000"/>
+          <w:bottom w:val="single" w:sz="2" w:space="0" w:color="000000"/>
+          <w:left w:val="single" w:sz="2" w:space="0" w:color="000000"/>
+          <w:right w:val="single" w:sz="2" w:space="0" w:color="000000"/>
+        </w:tblBorders>
+        <w:tblCellSpacing w:w="0" w:type="dxa"/>
+        <w:tblCellMar>
+          <w:top w:type="dxa" w:w="80"/>
+          <w:bottom w:type="dxa" w:w="80"/>
+          <w:left w:type="dxa" w:w="160"/>
+          <w:right w:type="dxa" w:w="160"/>
+        </w:tblCellMar>
+        <w:jc w:val="center"/>
+      </w:tblPr>
+      <w:tblGrid>
+        <w:gridCol w:w="4320"/>
+        <w:gridCol w:w="4320"/>
+      </w:tblGrid>
+      <w:tr>
+        <w:trPr/>
+        <w:tc>
+          <w:tcPr>
+            <w:tcBorders>
+              <w:top w:val="single" w:sz="1" w:space="0" w:color="000000"/>
+              <w:bottom w:val="single" w:sz="1" w:space="0" w:color="000000"/>
+              <w:left w:val="single" w:sz="1" w:space="0" w:color="000000"/>
+              <w:right w:val="single" w:sz="1" w:space="0" w:color="000000"/>
+            </w:tcBorders>
+          </w:tcPr>
+          <w:p>
+            <w:pPr>
+              <w:spacing w:lineRule="auto"/>
+            </w:pPr>
+            <w:r>
+              <w:rPr/>
+              <w:t xml:space="preserve">Estilo</w:t>
+            </w:r>
+          </w:p>
+        </w:tc>
+        <w:tc>
+          <w:tcPr>
+            <w:tcBorders>
+              <w:top w:val="single" w:sz="1" w:space="0" w:color="000000"/>
+              <w:bottom w:val="single" w:sz="1" w:space="0" w:color="000000"/>
+              <w:left w:val="single" w:sz="1" w:space="0" w:color="000000"/>
+              <w:right w:val="single" w:sz="1" w:space="0" w:color="000000"/>
+            </w:tcBorders>
+          </w:tcPr>
+          <w:p>
+            <w:pPr>
+              <w:spacing w:lineRule="auto"/>
+            </w:pPr>
+            <w:r>
+              <w:rPr/>
+              <w:t xml:space="preserve">Significado</w:t>
+            </w:r>
+          </w:p>
+        </w:tc>
+      </w:tr>
+      <w:tr>
+        <w:trPr/>
+        <w:tc>
+          <w:tcPr>
+            <w:tcBorders>
+              <w:top w:val="single" w:sz="1" w:space="0" w:color="000000"/>
+              <w:bottom w:val="single" w:sz="1" w:space="0" w:color="000000"/>
+              <w:left w:val="single" w:sz="1" w:space="0" w:color="000000"/>
+              <w:right w:val="single" w:sz="1" w:space="0" w:color="000000"/>
+            </w:tcBorders>
+          </w:tcPr>
+          <w:p>
+            <w:pPr>
+              <w:spacing w:lineRule="auto"/>
+            </w:pPr>
+            <w:r>
+              <w:rPr/>
+              <w:t xml:space="preserve">Hecho</w:t>
+            </w:r>
+          </w:p>
+        </w:tc>
+        <w:tc>
+          <w:tcPr>
+            <w:tcBorders>
+              <w:top w:val="single" w:sz="1" w:space="0" w:color="000000"/>
+              <w:bottom w:val="single" w:sz="1" w:space="0" w:color="000000"/>
+              <w:left w:val="single" w:sz="1" w:space="0" w:color="000000"/>
+              <w:right w:val="single" w:sz="1" w:space="0" w:color="000000"/>
+            </w:tcBorders>
+          </w:tcPr>
+          <w:p>
+            <w:pPr>
+              <w:spacing w:lineRule="auto"/>
+            </w:pPr>
+            <w:r>
+              <w:rPr/>
+              <w:t xml:space="preserve">Entregado en repo / prod</w:t>
+            </w:r>
+          </w:p>
+        </w:tc>
+      </w:tr>
+      <w:tr>
+        <w:trPr/>
+        <w:tc>
+          <w:tcPr>
+            <w:tcBorders>
+              <w:top w:val="single" w:sz="1" w:space="0" w:color="000000"/>
+              <w:bottom w:val="single" w:sz="1" w:space="0" w:color="000000"/>
+              <w:left w:val="single" w:sz="1" w:space="0" w:color="000000"/>
+              <w:right w:val="single" w:sz="1" w:space="0" w:color="000000"/>
+            </w:tcBorders>
+          </w:tcPr>
+          <w:p>
+            <w:pPr>
+              <w:spacing w:lineRule="auto"/>
+            </w:pPr>
+            <w:r>
+              <w:rPr/>
+              <w:t xml:space="preserve">En curso</w:t>
+            </w:r>
+          </w:p>
+        </w:tc>
+        <w:tc>
+          <w:tcPr>
+            <w:tcBorders>
+              <w:top w:val="single" w:sz="1" w:space="0" w:color="000000"/>
+              <w:bottom w:val="single" w:sz="1" w:space="0" w:color="000000"/>
+              <w:left w:val="single" w:sz="1" w:space="0" w:color="000000"/>
+              <w:right w:val="single" w:sz="1" w:space="0" w:color="000000"/>
+            </w:tcBorders>
+          </w:tcPr>
+          <w:p>
+            <w:pPr>
+              <w:spacing w:lineRule="auto"/>
+            </w:pPr>
+            <w:r>
+              <w:rPr/>
+              <w:t xml:space="preserve">Trabajo activo</w:t>
+            </w:r>
+          </w:p>
+        </w:tc>
+      </w:tr>
+      <w:tr>
+        <w:trPr/>
+        <w:tc>
+          <w:tcPr>
+            <w:tcBorders>
+              <w:top w:val="single" w:sz="1" w:space="0" w:color="000000"/>
+              <w:bottom w:val="single" w:sz="1" w:space="0" w:color="000000"/>
+              <w:left w:val="single" w:sz="1" w:space="0" w:color="000000"/>
+              <w:right w:val="single" w:sz="1" w:space="0" w:color="000000"/>
+            </w:tcBorders>
+          </w:tcPr>
+          <w:p>
+            <w:pPr>
+              <w:spacing w:lineRule="auto"/>
+            </w:pPr>
+            <w:r>
+              <w:rPr/>
+              <w:t xml:space="preserve">Planificado</w:t>
+            </w:r>
+          </w:p>
+        </w:tc>
+        <w:tc>
+          <w:tcPr>
+            <w:tcBorders>
+              <w:top w:val="single" w:sz="1" w:space="0" w:color="000000"/>
+              <w:bottom w:val="single" w:sz="1" w:space="0" w:color="000000"/>
+              <w:left w:val="single" w:sz="1" w:space="0" w:color="000000"/>
+              <w:right w:val="single" w:sz="1" w:space="0" w:color="000000"/>
+            </w:tcBorders>
+          </w:tcPr>
+          <w:p>
+            <w:pPr>
+              <w:spacing w:lineRule="auto"/>
+            </w:pPr>
+            <w:r>
+              <w:rPr/>
+              <w:t xml:space="preserve">No iniciado</w:t>
+            </w:r>
+          </w:p>
+        </w:tc>
+      </w:tr>
+      <w:tr>
+        <w:trPr/>
+        <w:tc>
+          <w:tcPr>
+            <w:tcBorders>
+              <w:top w:val="single" w:sz="1" w:space="0" w:color="000000"/>
+              <w:bottom w:val="single" w:sz="1" w:space="0" w:color="000000"/>
+              <w:left w:val="single" w:sz="1" w:space="0" w:color="000000"/>
+              <w:right w:val="single" w:sz="1" w:space="0" w:color="000000"/>
+            </w:tcBorders>
+          </w:tcPr>
+          <w:p>
+            <w:pPr>
+              <w:spacing w:lineRule="auto"/>
+            </w:pPr>
+            <w:r>
+              <w:rPr/>
+              <w:t xml:space="preserve">—</w:t>
+            </w:r>
+          </w:p>
+        </w:tc>
+        <w:tc>
+          <w:tcPr>
+            <w:tcBorders>
+              <w:top w:val="single" w:sz="1" w:space="0" w:color="000000"/>
+              <w:bottom w:val="single" w:sz="1" w:space="0" w:color="000000"/>
+              <w:left w:val="single" w:sz="1" w:space="0" w:color="000000"/>
+              <w:right w:val="single" w:sz="1" w:space="0" w:color="000000"/>
+            </w:tcBorders>
+          </w:tcPr>
+          <w:p>
+            <w:pPr>
+              <w:spacing w:lineRule="auto"/>
+            </w:pPr>
+            <w:r>
+              <w:rPr/>
+              <w:t xml:space="preserve">Fuera del trimestre</w:t>
+            </w:r>
+          </w:p>
+        </w:tc>
+      </w:tr>
+    </w:tbl>
+    <w:p>
+      <w:pPr>
+        <w:spacing w:lineRule="auto"/>
+      </w:pPr>
+      <w:r>
+        <w:rPr/>
+      </w:r>
+    </w:p>
+    <w:p>
+      <w:pPr>
+        <w:pStyle w:val="Heading3"/>
+        <w:spacing w:lineRule="auto"/>
+      </w:pPr>
+      <w:r>
+        <w:rPr/>
+        <w:t xml:space="preserve">Gantt por fase (trimestres 2026–2027)</w:t>
+      </w:r>
+    </w:p>
+    <w:tbl>
+      <w:tblPr>
+        <w:tblBorders>
+          <w:top w:val="single" w:sz="2" w:space="0" w:color="000000"/>
+          <w:bottom w:val="single" w:sz="2" w:space="0" w:color="000000"/>
+          <w:left w:val="single" w:sz="2" w:space="0" w:color="000000"/>
+          <w:right w:val="single" w:sz="2" w:space="0" w:color="000000"/>
+        </w:tblBorders>
+        <w:tblCellSpacing w:w="0" w:type="dxa"/>
+        <w:tblCellMar>
+          <w:top w:type="dxa" w:w="80"/>
+          <w:bottom w:type="dxa" w:w="80"/>
+          <w:left w:type="dxa" w:w="160"/>
+          <w:right w:type="dxa" w:w="160"/>
+        </w:tblCellMar>
+        <w:jc w:val="center"/>
+      </w:tblPr>
+      <w:tblGrid>
+        <w:gridCol w:w="1728"/>
+        <w:gridCol w:w="1728"/>
+        <w:gridCol w:w="1728"/>
+        <w:gridCol w:w="1728"/>
+        <w:gridCol w:w="1728"/>
+      </w:tblGrid>
+      <w:tr>
+        <w:trPr/>
+        <w:tc>
+          <w:tcPr>
+            <w:tcBorders>
+              <w:top w:val="single" w:sz="1" w:space="0" w:color="000000"/>
+              <w:bottom w:val="single" w:sz="1" w:space="0" w:color="000000"/>
+              <w:left w:val="single" w:sz="1" w:space="0" w:color="000000"/>
+              <w:right w:val="single" w:sz="1" w:space="0" w:color="000000"/>
+            </w:tcBorders>
+          </w:tcPr>
+          <w:p>
+            <w:pPr>
+              <w:spacing w:lineRule="auto"/>
+            </w:pPr>
+            <w:r>
+              <w:rPr/>
+              <w:t xml:space="preserve">Fase</w:t>
+            </w:r>
+          </w:p>
+        </w:tc>
+        <w:tc>
+          <w:tcPr>
+            <w:tcBorders>
+              <w:top w:val="single" w:sz="1" w:space="0" w:color="000000"/>
+              <w:bottom w:val="single" w:sz="1" w:space="0" w:color="000000"/>
+              <w:left w:val="single" w:sz="1" w:space="0" w:color="000000"/>
+              <w:right w:val="single" w:sz="1" w:space="0" w:color="000000"/>
+            </w:tcBorders>
+          </w:tcPr>
+          <w:p>
+            <w:pPr>
+              <w:spacing w:lineRule="auto"/>
+            </w:pPr>
+            <w:r>
+              <w:rPr/>
+              <w:t xml:space="preserve">2026 T2</w:t>
+            </w:r>
+          </w:p>
+          <w:p>
+            <w:pPr>
+              <w:spacing w:lineRule="auto"/>
+            </w:pPr>
+            <w:r>
+              <w:rPr/>
+              <w:br w:type="textWrapping"/>
+            </w:r>
+          </w:p>
+          <w:p>
+            <w:pPr>
+              <w:spacing w:lineRule="auto"/>
+            </w:pPr>
+            <w:r>
+              <w:rPr/>
+              <w:t xml:space="preserve">abr–jun</w:t>
+            </w:r>
+          </w:p>
+        </w:tc>
+        <w:tc>
+          <w:tcPr>
+            <w:tcBorders>
+              <w:top w:val="single" w:sz="1" w:space="0" w:color="000000"/>
+              <w:bottom w:val="single" w:sz="1" w:space="0" w:color="000000"/>
+              <w:left w:val="single" w:sz="1" w:space="0" w:color="000000"/>
+              <w:right w:val="single" w:sz="1" w:space="0" w:color="000000"/>
+            </w:tcBorders>
+          </w:tcPr>
+          <w:p>
+            <w:pPr>
+              <w:spacing w:lineRule="auto"/>
+            </w:pPr>
+            <w:r>
+              <w:rPr/>
+              <w:t xml:space="preserve">2026 T3</w:t>
+            </w:r>
+          </w:p>
+          <w:p>
+            <w:pPr>
+              <w:spacing w:lineRule="auto"/>
+            </w:pPr>
+            <w:r>
+              <w:rPr/>
+              <w:br w:type="textWrapping"/>
+            </w:r>
+          </w:p>
+          <w:p>
+            <w:pPr>
+              <w:spacing w:lineRule="auto"/>
+            </w:pPr>
+            <w:r>
+              <w:rPr/>
+              <w:t xml:space="preserve">jul–sep</w:t>
+            </w:r>
+          </w:p>
+        </w:tc>
+        <w:tc>
+          <w:tcPr>
+            <w:tcBorders>
+              <w:top w:val="single" w:sz="1" w:space="0" w:color="000000"/>
+              <w:bottom w:val="single" w:sz="1" w:space="0" w:color="000000"/>
+              <w:left w:val="single" w:sz="1" w:space="0" w:color="000000"/>
+              <w:right w:val="single" w:sz="1" w:space="0" w:color="000000"/>
+            </w:tcBorders>
+          </w:tcPr>
+          <w:p>
+            <w:pPr>
+              <w:spacing w:lineRule="auto"/>
+            </w:pPr>
+            <w:r>
+              <w:rPr/>
+              <w:t xml:space="preserve">2026 T4</w:t>
+            </w:r>
+          </w:p>
+          <w:p>
+            <w:pPr>
+              <w:spacing w:lineRule="auto"/>
+            </w:pPr>
+            <w:r>
+              <w:rPr/>
+              <w:br w:type="textWrapping"/>
+            </w:r>
+          </w:p>
+          <w:p>
+            <w:pPr>
+              <w:spacing w:lineRule="auto"/>
+            </w:pPr>
+            <w:r>
+              <w:rPr/>
+              <w:t xml:space="preserve">oct–dic</w:t>
+            </w:r>
+          </w:p>
+        </w:tc>
+        <w:tc>
+          <w:tcPr>
+            <w:tcBorders>
+              <w:top w:val="single" w:sz="1" w:space="0" w:color="000000"/>
+              <w:bottom w:val="single" w:sz="1" w:space="0" w:color="000000"/>
+              <w:left w:val="single" w:sz="1" w:space="0" w:color="000000"/>
+              <w:right w:val="single" w:sz="1" w:space="0" w:color="000000"/>
+            </w:tcBorders>
+          </w:tcPr>
+          <w:p>
+            <w:pPr>
+              <w:spacing w:lineRule="auto"/>
+            </w:pPr>
+            <w:r>
+              <w:rPr/>
+              <w:t xml:space="preserve">2027 T1</w:t>
+            </w:r>
+          </w:p>
+          <w:p>
+            <w:pPr>
+              <w:spacing w:lineRule="auto"/>
+            </w:pPr>
+            <w:r>
+              <w:rPr/>
+              <w:br w:type="textWrapping"/>
+            </w:r>
+          </w:p>
+          <w:p>
+            <w:pPr>
+              <w:spacing w:lineRule="auto"/>
+            </w:pPr>
+            <w:r>
+              <w:rPr/>
+              <w:t xml:space="preserve">ene–mar</w:t>
+            </w:r>
+          </w:p>
+        </w:tc>
+      </w:tr>
+      <w:tr>
+        <w:trPr/>
+        <w:tc>
+          <w:tcPr>
+            <w:tcBorders>
+              <w:top w:val="single" w:sz="1" w:space="0" w:color="000000"/>
+              <w:bottom w:val="single" w:sz="1" w:space="0" w:color="000000"/>
+              <w:left w:val="single" w:sz="1" w:space="0" w:color="000000"/>
+              <w:right w:val="single" w:sz="1" w:space="0" w:color="000000"/>
+            </w:tcBorders>
+          </w:tcPr>
+          <w:p>
+            <w:pPr>
+              <w:spacing w:lineRule="auto"/>
+            </w:pPr>
+            <w:r>
+              <w:rPr/>
+              <w:t xml:space="preserve">0 · Descubrimiento</w:t>
+            </w:r>
+          </w:p>
+        </w:tc>
+        <w:tc>
+          <w:tcPr>
+            <w:tcBorders>
+              <w:top w:val="single" w:sz="1" w:space="0" w:color="000000"/>
+              <w:bottom w:val="single" w:sz="1" w:space="0" w:color="000000"/>
+              <w:left w:val="single" w:sz="1" w:space="0" w:color="000000"/>
+              <w:right w:val="single" w:sz="1" w:space="0" w:color="000000"/>
+            </w:tcBorders>
+          </w:tcPr>
+          <w:p>
+            <w:pPr>
+              <w:spacing w:lineRule="auto"/>
+            </w:pPr>
+            <w:r>
+              <w:rPr/>
+              <w:t xml:space="preserve">En curso</w:t>
+            </w:r>
+          </w:p>
+        </w:tc>
+        <w:tc>
+          <w:tcPr>
+            <w:tcBorders>
+              <w:top w:val="single" w:sz="1" w:space="0" w:color="000000"/>
+              <w:bottom w:val="single" w:sz="1" w:space="0" w:color="000000"/>
+              <w:left w:val="single" w:sz="1" w:space="0" w:color="000000"/>
+              <w:right w:val="single" w:sz="1" w:space="0" w:color="000000"/>
+            </w:tcBorders>
+          </w:tcPr>
+          <w:p>
+            <w:pPr>
+              <w:spacing w:lineRule="auto"/>
+            </w:pPr>
+            <w:r>
+              <w:rPr/>
+              <w:t xml:space="preserve">Planificado</w:t>
+            </w:r>
+          </w:p>
+        </w:tc>
+        <w:tc>
+          <w:tcPr>
+            <w:tcBorders>
+              <w:top w:val="single" w:sz="1" w:space="0" w:color="000000"/>
+              <w:bottom w:val="single" w:sz="1" w:space="0" w:color="000000"/>
+              <w:left w:val="single" w:sz="1" w:space="0" w:color="000000"/>
+              <w:right w:val="single" w:sz="1" w:space="0" w:color="000000"/>
+            </w:tcBorders>
+          </w:tcPr>
+          <w:p>
+            <w:pPr>
+              <w:spacing w:lineRule="auto"/>
+            </w:pPr>
+            <w:r>
+              <w:rPr/>
+              <w:t xml:space="preserve">—</w:t>
+            </w:r>
+          </w:p>
+        </w:tc>
+        <w:tc>
+          <w:tcPr>
+            <w:tcBorders>
+              <w:top w:val="single" w:sz="1" w:space="0" w:color="000000"/>
+              <w:bottom w:val="single" w:sz="1" w:space="0" w:color="000000"/>
+              <w:left w:val="single" w:sz="1" w:space="0" w:color="000000"/>
+              <w:right w:val="single" w:sz="1" w:space="0" w:color="000000"/>
+            </w:tcBorders>
+          </w:tcPr>
+          <w:p>
+            <w:pPr>
+              <w:spacing w:lineRule="auto"/>
+            </w:pPr>
+            <w:r>
+              <w:rPr/>
+              <w:t xml:space="preserve">—</w:t>
+            </w:r>
+          </w:p>
+        </w:tc>
+      </w:tr>
+      <w:tr>
+        <w:trPr/>
+        <w:tc>
+          <w:tcPr>
+            <w:tcBorders>
+              <w:top w:val="single" w:sz="1" w:space="0" w:color="000000"/>
+              <w:bottom w:val="single" w:sz="1" w:space="0" w:color="000000"/>
+              <w:left w:val="single" w:sz="1" w:space="0" w:color="000000"/>
+              <w:right w:val="single" w:sz="1" w:space="0" w:color="000000"/>
+            </w:tcBorders>
+          </w:tcPr>
+          <w:p>
+            <w:pPr>
+              <w:spacing w:lineRule="auto"/>
+            </w:pPr>
+            <w:r>
+              <w:rPr/>
+              <w:t xml:space="preserve">1 · Concierge (20 match)</w:t>
+            </w:r>
+          </w:p>
+        </w:tc>
+        <w:tc>
+          <w:tcPr>
+            <w:tcBorders>
+              <w:top w:val="single" w:sz="1" w:space="0" w:color="000000"/>
+              <w:bottom w:val="single" w:sz="1" w:space="0" w:color="000000"/>
+              <w:left w:val="single" w:sz="1" w:space="0" w:color="000000"/>
+              <w:right w:val="single" w:sz="1" w:space="0" w:color="000000"/>
+            </w:tcBorders>
+          </w:tcPr>
+          <w:p>
+            <w:pPr>
+              <w:spacing w:lineRule="auto"/>
+            </w:pPr>
+            <w:r>
+              <w:rPr/>
+              <w:t xml:space="preserve">Planificado</w:t>
+            </w:r>
+          </w:p>
+        </w:tc>
+        <w:tc>
+          <w:tcPr>
+            <w:tcBorders>
+              <w:top w:val="single" w:sz="1" w:space="0" w:color="000000"/>
+              <w:bottom w:val="single" w:sz="1" w:space="0" w:color="000000"/>
+              <w:left w:val="single" w:sz="1" w:space="0" w:color="000000"/>
+              <w:right w:val="single" w:sz="1" w:space="0" w:color="000000"/>
+            </w:tcBorders>
+          </w:tcPr>
+          <w:p>
+            <w:pPr>
+              <w:spacing w:lineRule="auto"/>
+            </w:pPr>
+            <w:r>
+              <w:rPr/>
+              <w:t xml:space="preserve">En curso</w:t>
+            </w:r>
+          </w:p>
+        </w:tc>
+        <w:tc>
+          <w:tcPr>
+            <w:tcBorders>
+              <w:top w:val="single" w:sz="1" w:space="0" w:color="000000"/>
+              <w:bottom w:val="single" w:sz="1" w:space="0" w:color="000000"/>
+              <w:left w:val="single" w:sz="1" w:space="0" w:color="000000"/>
+              <w:right w:val="single" w:sz="1" w:space="0" w:color="000000"/>
+            </w:tcBorders>
+          </w:tcPr>
+          <w:p>
+            <w:pPr>
+              <w:spacing w:lineRule="auto"/>
+            </w:pPr>
+            <w:r>
+              <w:rPr/>
+              <w:t xml:space="preserve">Planificado</w:t>
+            </w:r>
+          </w:p>
+        </w:tc>
+        <w:tc>
+          <w:tcPr>
+            <w:tcBorders>
+              <w:top w:val="single" w:sz="1" w:space="0" w:color="000000"/>
+              <w:bottom w:val="single" w:sz="1" w:space="0" w:color="000000"/>
+              <w:left w:val="single" w:sz="1" w:space="0" w:color="000000"/>
+              <w:right w:val="single" w:sz="1" w:space="0" w:color="000000"/>
+            </w:tcBorders>
+          </w:tcPr>
+          <w:p>
+            <w:pPr>
+              <w:spacing w:lineRule="auto"/>
+            </w:pPr>
+            <w:r>
+              <w:rPr/>
+              <w:t xml:space="preserve">—</w:t>
+            </w:r>
+          </w:p>
+        </w:tc>
+      </w:tr>
+      <w:tr>
+        <w:trPr/>
+        <w:tc>
+          <w:tcPr>
+            <w:tcBorders>
+              <w:top w:val="single" w:sz="1" w:space="0" w:color="000000"/>
+              <w:bottom w:val="single" w:sz="1" w:space="0" w:color="000000"/>
+              <w:left w:val="single" w:sz="1" w:space="0" w:color="000000"/>
+              <w:right w:val="single" w:sz="1" w:space="0" w:color="000000"/>
+            </w:tcBorders>
+          </w:tcPr>
+          <w:p>
+            <w:pPr>
+              <w:spacing w:lineRule="auto"/>
+            </w:pPr>
+            <w:r>
+              <w:rPr/>
+              <w:t xml:space="preserve">2 · MVP digital</w:t>
+            </w:r>
+          </w:p>
+        </w:tc>
+        <w:tc>
+          <w:tcPr>
+            <w:tcBorders>
+              <w:top w:val="single" w:sz="1" w:space="0" w:color="000000"/>
+              <w:bottom w:val="single" w:sz="1" w:space="0" w:color="000000"/>
+              <w:left w:val="single" w:sz="1" w:space="0" w:color="000000"/>
+              <w:right w:val="single" w:sz="1" w:space="0" w:color="000000"/>
+            </w:tcBorders>
+          </w:tcPr>
+          <w:p>
+            <w:pPr>
+              <w:spacing w:lineRule="auto"/>
+            </w:pPr>
+            <w:r>
+              <w:rPr/>
+              <w:t xml:space="preserve">Hecho</w:t>
+            </w:r>
+          </w:p>
+        </w:tc>
+        <w:tc>
+          <w:tcPr>
+            <w:tcBorders>
+              <w:top w:val="single" w:sz="1" w:space="0" w:color="000000"/>
+              <w:bottom w:val="single" w:sz="1" w:space="0" w:color="000000"/>
+              <w:left w:val="single" w:sz="1" w:space="0" w:color="000000"/>
+              <w:right w:val="single" w:sz="1" w:space="0" w:color="000000"/>
+            </w:tcBorders>
+          </w:tcPr>
+          <w:p>
+            <w:pPr>
+              <w:spacing w:lineRule="auto"/>
+            </w:pPr>
+            <w:r>
+              <w:rPr/>
+              <w:t xml:space="preserve">Hecho</w:t>
+            </w:r>
+          </w:p>
+        </w:tc>
+        <w:tc>
+          <w:tcPr>
+            <w:tcBorders>
+              <w:top w:val="single" w:sz="1" w:space="0" w:color="000000"/>
+              <w:bottom w:val="single" w:sz="1" w:space="0" w:color="000000"/>
+              <w:left w:val="single" w:sz="1" w:space="0" w:color="000000"/>
+              <w:right w:val="single" w:sz="1" w:space="0" w:color="000000"/>
+            </w:tcBorders>
+          </w:tcPr>
+          <w:p>
+            <w:pPr>
+              <w:spacing w:lineRule="auto"/>
+            </w:pPr>
+            <w:r>
+              <w:rPr/>
+              <w:t xml:space="preserve">Refino</w:t>
+            </w:r>
+          </w:p>
+        </w:tc>
+        <w:tc>
+          <w:tcPr>
+            <w:tcBorders>
+              <w:top w:val="single" w:sz="1" w:space="0" w:color="000000"/>
+              <w:bottom w:val="single" w:sz="1" w:space="0" w:color="000000"/>
+              <w:left w:val="single" w:sz="1" w:space="0" w:color="000000"/>
+              <w:right w:val="single" w:sz="1" w:space="0" w:color="000000"/>
+            </w:tcBorders>
+          </w:tcPr>
+          <w:p>
+            <w:pPr>
+              <w:spacing w:lineRule="auto"/>
+            </w:pPr>
+            <w:r>
+              <w:rPr/>
+              <w:t xml:space="preserve">2.10 cobros</w:t>
+            </w:r>
+          </w:p>
+        </w:tc>
+      </w:tr>
+      <w:tr>
+        <w:trPr/>
+        <w:tc>
+          <w:tcPr>
+            <w:tcBorders>
+              <w:top w:val="single" w:sz="1" w:space="0" w:color="000000"/>
+              <w:bottom w:val="single" w:sz="1" w:space="0" w:color="000000"/>
+              <w:left w:val="single" w:sz="1" w:space="0" w:color="000000"/>
+              <w:right w:val="single" w:sz="1" w:space="0" w:color="000000"/>
+            </w:tcBorders>
+          </w:tcPr>
+          <w:p>
+            <w:pPr>
+              <w:spacing w:lineRule="auto"/>
+            </w:pPr>
+            <w:r>
+              <w:rPr/>
+              <w:t xml:space="preserve">3 · Piloto confianza</w:t>
+            </w:r>
+          </w:p>
+        </w:tc>
+        <w:tc>
+          <w:tcPr>
+            <w:tcBorders>
+              <w:top w:val="single" w:sz="1" w:space="0" w:color="000000"/>
+              <w:bottom w:val="single" w:sz="1" w:space="0" w:color="000000"/>
+              <w:left w:val="single" w:sz="1" w:space="0" w:color="000000"/>
+              <w:right w:val="single" w:sz="1" w:space="0" w:color="000000"/>
+            </w:tcBorders>
+          </w:tcPr>
+          <w:p>
+            <w:pPr>
+              <w:spacing w:lineRule="auto"/>
+            </w:pPr>
+            <w:r>
+              <w:rPr/>
+              <w:t xml:space="preserve">—</w:t>
+            </w:r>
+          </w:p>
+        </w:tc>
+        <w:tc>
+          <w:tcPr>
+            <w:tcBorders>
+              <w:top w:val="single" w:sz="1" w:space="0" w:color="000000"/>
+              <w:bottom w:val="single" w:sz="1" w:space="0" w:color="000000"/>
+              <w:left w:val="single" w:sz="1" w:space="0" w:color="000000"/>
+              <w:right w:val="single" w:sz="1" w:space="0" w:color="000000"/>
+            </w:tcBorders>
+          </w:tcPr>
+          <w:p>
+            <w:pPr>
+              <w:spacing w:lineRule="auto"/>
+            </w:pPr>
+            <w:r>
+              <w:rPr/>
+              <w:t xml:space="preserve">—</w:t>
+            </w:r>
+          </w:p>
+        </w:tc>
+        <w:tc>
+          <w:tcPr>
+            <w:tcBorders>
+              <w:top w:val="single" w:sz="1" w:space="0" w:color="000000"/>
+              <w:bottom w:val="single" w:sz="1" w:space="0" w:color="000000"/>
+              <w:left w:val="single" w:sz="1" w:space="0" w:color="000000"/>
+              <w:right w:val="single" w:sz="1" w:space="0" w:color="000000"/>
+            </w:tcBorders>
+          </w:tcPr>
+          <w:p>
+            <w:pPr>
+              <w:spacing w:lineRule="auto"/>
+            </w:pPr>
+            <w:r>
+              <w:rPr/>
+              <w:t xml:space="preserve">Planificado</w:t>
+            </w:r>
+          </w:p>
+        </w:tc>
+        <w:tc>
+          <w:tcPr>
+            <w:tcBorders>
+              <w:top w:val="single" w:sz="1" w:space="0" w:color="000000"/>
+              <w:bottom w:val="single" w:sz="1" w:space="0" w:color="000000"/>
+              <w:left w:val="single" w:sz="1" w:space="0" w:color="000000"/>
+              <w:right w:val="single" w:sz="1" w:space="0" w:color="000000"/>
+            </w:tcBorders>
+          </w:tcPr>
+          <w:p>
+            <w:pPr>
+              <w:spacing w:lineRule="auto"/>
+            </w:pPr>
+            <w:r>
+              <w:rPr/>
+              <w:t xml:space="preserve">En curso</w:t>
+            </w:r>
+          </w:p>
+        </w:tc>
+      </w:tr>
+      <w:tr>
+        <w:trPr/>
+        <w:tc>
+          <w:tcPr>
+            <w:tcBorders>
+              <w:top w:val="single" w:sz="1" w:space="0" w:color="000000"/>
+              <w:bottom w:val="single" w:sz="1" w:space="0" w:color="000000"/>
+              <w:left w:val="single" w:sz="1" w:space="0" w:color="000000"/>
+              <w:right w:val="single" w:sz="1" w:space="0" w:color="000000"/>
+            </w:tcBorders>
+          </w:tcPr>
+          <w:p>
+            <w:pPr>
+              <w:spacing w:lineRule="auto"/>
+            </w:pPr>
+            <w:r>
+              <w:rPr/>
+              <w:t xml:space="preserve">4 · SaaS / match auto</w:t>
+            </w:r>
+          </w:p>
+        </w:tc>
+        <w:tc>
+          <w:tcPr>
+            <w:tcBorders>
+              <w:top w:val="single" w:sz="1" w:space="0" w:color="000000"/>
+              <w:bottom w:val="single" w:sz="1" w:space="0" w:color="000000"/>
+              <w:left w:val="single" w:sz="1" w:space="0" w:color="000000"/>
+              <w:right w:val="single" w:sz="1" w:space="0" w:color="000000"/>
+            </w:tcBorders>
+          </w:tcPr>
+          <w:p>
+            <w:pPr>
+              <w:spacing w:lineRule="auto"/>
+            </w:pPr>
+            <w:r>
+              <w:rPr/>
+              <w:t xml:space="preserve">—</w:t>
+            </w:r>
+          </w:p>
+        </w:tc>
+        <w:tc>
+          <w:tcPr>
+            <w:tcBorders>
+              <w:top w:val="single" w:sz="1" w:space="0" w:color="000000"/>
+              <w:bottom w:val="single" w:sz="1" w:space="0" w:color="000000"/>
+              <w:left w:val="single" w:sz="1" w:space="0" w:color="000000"/>
+              <w:right w:val="single" w:sz="1" w:space="0" w:color="000000"/>
+            </w:tcBorders>
+          </w:tcPr>
+          <w:p>
+            <w:pPr>
+              <w:spacing w:lineRule="auto"/>
+            </w:pPr>
+            <w:r>
+              <w:rPr/>
+              <w:t xml:space="preserve">—</w:t>
+            </w:r>
+          </w:p>
+        </w:tc>
+        <w:tc>
+          <w:tcPr>
+            <w:tcBorders>
+              <w:top w:val="single" w:sz="1" w:space="0" w:color="000000"/>
+              <w:bottom w:val="single" w:sz="1" w:space="0" w:color="000000"/>
+              <w:left w:val="single" w:sz="1" w:space="0" w:color="000000"/>
+              <w:right w:val="single" w:sz="1" w:space="0" w:color="000000"/>
+            </w:tcBorders>
+          </w:tcPr>
+          <w:p>
+            <w:pPr>
+              <w:spacing w:lineRule="auto"/>
+            </w:pPr>
+            <w:r>
+              <w:rPr/>
+              <w:t xml:space="preserve">—</w:t>
+            </w:r>
+          </w:p>
+        </w:tc>
+        <w:tc>
+          <w:tcPr>
+            <w:tcBorders>
+              <w:top w:val="single" w:sz="1" w:space="0" w:color="000000"/>
+              <w:bottom w:val="single" w:sz="1" w:space="0" w:color="000000"/>
+              <w:left w:val="single" w:sz="1" w:space="0" w:color="000000"/>
+              <w:right w:val="single" w:sz="1" w:space="0" w:color="000000"/>
+            </w:tcBorders>
+          </w:tcPr>
+          <w:p>
+            <w:pPr>
+              <w:spacing w:lineRule="auto"/>
+            </w:pPr>
+            <w:r>
+              <w:rPr/>
+              <w:t xml:space="preserve">Planificado</w:t>
+            </w:r>
+          </w:p>
+        </w:tc>
+      </w:tr>
+    </w:tbl>
+    <w:p>
+      <w:pPr>
+        <w:spacing w:lineRule="auto"/>
+      </w:pPr>
+      <w:r>
+        <w:rPr/>
+      </w:r>
+    </w:p>
+    <w:p>
+      <w:pPr>
+        <w:spacing w:lineRule="auto"/>
+      </w:pPr>
+      <w:r>
+        <w:rPr>
+          <w:b/>
+        </w:rPr>
+        <w:t xml:space="preserve">Interpretación mayo 2026:</w:t>
+      </w:r>
+      <w:r>
+        <w:rPr/>
+        <w:t xml:space="preserve"> fase 2 adelantada (M3 producción antes de oct 2026). Prioridad inmediata: SQL 008 prod, piloto concierge M2, luego mis cargas por usuario.</w:t>
+      </w:r>
+    </w:p>
+    <w:p>
+      <w:pPr>
+        <w:pStyle w:val="Heading2"/>
+        <w:spacing w:lineRule="auto"/>
+      </w:pPr>
+      <w:r>
+        <w:rPr/>
+        <w:t xml:space="preserve">12. Cronograma — hitos y tareas</w:t>
+      </w:r>
+    </w:p>
+    <w:p>
+      <w:pPr>
+        <w:pStyle w:val="Heading3"/>
+        <w:spacing w:lineRule="auto"/>
+      </w:pPr>
+      <w:r>
+        <w:rPr/>
+        <w:t xml:space="preserve">12.1 Hitos</w:t>
+      </w:r>
+    </w:p>
+    <w:tbl>
+      <w:tblPr>
+        <w:tblBorders>
+          <w:top w:val="single" w:sz="1" w:space="0" w:color="000000"/>
+          <w:bottom w:val="single" w:sz="1" w:space="0" w:color="000000"/>
+          <w:left w:val="single" w:sz="1" w:space="0" w:color="000000"/>
+          <w:right w:val="single" w:sz="1" w:space="0" w:color="000000"/>
+        </w:tblBorders>
+        <w:tblCellSpacing w:w="0" w:type="dxa"/>
+        <w:tblCellMar>
+          <w:top w:type="dxa" w:w="80"/>
+          <w:bottom w:type="dxa" w:w="80"/>
+          <w:left w:type="dxa" w:w="160"/>
+          <w:right w:type="dxa" w:w="160"/>
+        </w:tblCellMar>
+        <w:jc w:val="center"/>
+      </w:tblPr>
+      <w:tblGrid>
+        <w:gridCol w:w="2880"/>
+        <w:gridCol w:w="2880"/>
+        <w:gridCol w:w="2880"/>
+      </w:tblGrid>
+      <w:tr>
+        <w:trPr/>
+        <w:tc>
+          <w:tcPr>
+            <w:tcBorders>
+              <w:top w:val="single" w:sz="1" w:space="0" w:color="000000"/>
+              <w:bottom w:val="single" w:sz="1" w:space="0" w:color="000000"/>
+              <w:left w:val="single" w:sz="1" w:space="0" w:color="000000"/>
+              <w:right w:val="single" w:sz="1" w:space="0" w:color="000000"/>
+            </w:tcBorders>
+          </w:tcPr>
+          <w:p>
+            <w:pPr>
+              <w:spacing w:lineRule="auto"/>
+            </w:pPr>
+            <w:r>
+              <w:rPr/>
+              <w:t xml:space="preserve">Hito</w:t>
+            </w:r>
+          </w:p>
+        </w:tc>
+        <w:tc>
+          <w:tcPr>
+            <w:tcBorders>
+              <w:top w:val="single" w:sz="1" w:space="0" w:color="000000"/>
+              <w:bottom w:val="single" w:sz="1" w:space="0" w:color="000000"/>
+              <w:left w:val="single" w:sz="1" w:space="0" w:color="000000"/>
+              <w:right w:val="single" w:sz="1" w:space="0" w:color="000000"/>
+            </w:tcBorders>
+          </w:tcPr>
+          <w:p>
+            <w:pPr>
+              <w:spacing w:lineRule="auto"/>
+            </w:pPr>
+            <w:r>
+              <w:rPr/>
+              <w:t xml:space="preserve">Fecha plan</w:t>
+            </w:r>
+          </w:p>
+        </w:tc>
+        <w:tc>
+          <w:tcPr>
+            <w:tcBorders>
+              <w:top w:val="single" w:sz="1" w:space="0" w:color="000000"/>
+              <w:bottom w:val="single" w:sz="1" w:space="0" w:color="000000"/>
+              <w:left w:val="single" w:sz="1" w:space="0" w:color="000000"/>
+              <w:right w:val="single" w:sz="1" w:space="0" w:color="000000"/>
+            </w:tcBorders>
+          </w:tcPr>
+          <w:p>
+            <w:pPr>
+              <w:spacing w:lineRule="auto"/>
+            </w:pPr>
+            <w:r>
+              <w:rPr/>
+              <w:t xml:space="preserve">Estado real</w:t>
+            </w:r>
+          </w:p>
+        </w:tc>
+      </w:tr>
+      <w:tr>
+        <w:trPr/>
+        <w:tc>
+          <w:tcPr>
+            <w:tcBorders>
+              <w:top w:val="single" w:sz="1" w:space="0" w:color="000000"/>
+              <w:bottom w:val="single" w:sz="1" w:space="0" w:color="000000"/>
+              <w:left w:val="single" w:sz="1" w:space="0" w:color="000000"/>
+              <w:right w:val="single" w:sz="1" w:space="0" w:color="000000"/>
+            </w:tcBorders>
+          </w:tcPr>
+          <w:p>
+            <w:pPr>
+              <w:spacing w:lineRule="auto"/>
+            </w:pPr>
+            <w:r>
+              <w:rPr/>
+              <w:t xml:space="preserve">M1 Descubrimiento + legal</w:t>
+            </w:r>
+          </w:p>
+        </w:tc>
+        <w:tc>
+          <w:tcPr>
+            <w:tcBorders>
+              <w:top w:val="single" w:sz="1" w:space="0" w:color="000000"/>
+              <w:bottom w:val="single" w:sz="1" w:space="0" w:color="000000"/>
+              <w:left w:val="single" w:sz="1" w:space="0" w:color="000000"/>
+              <w:right w:val="single" w:sz="1" w:space="0" w:color="000000"/>
+            </w:tcBorders>
+          </w:tcPr>
+          <w:p>
+            <w:pPr>
+              <w:spacing w:lineRule="auto"/>
+            </w:pPr>
+            <w:r>
+              <w:rPr/>
+              <w:t xml:space="preserve">28-jun-2026</w:t>
+            </w:r>
+          </w:p>
+        </w:tc>
+        <w:tc>
+          <w:tcPr>
+            <w:tcBorders>
+              <w:top w:val="single" w:sz="1" w:space="0" w:color="000000"/>
+              <w:bottom w:val="single" w:sz="1" w:space="0" w:color="000000"/>
+              <w:left w:val="single" w:sz="1" w:space="0" w:color="000000"/>
+              <w:right w:val="single" w:sz="1" w:space="0" w:color="000000"/>
+            </w:tcBorders>
+          </w:tcPr>
+          <w:p>
+            <w:pPr>
+              <w:spacing w:lineRule="auto"/>
+            </w:pPr>
+            <w:r>
+              <w:rPr/>
+              <w:t xml:space="preserve">En curso</w:t>
+            </w:r>
+          </w:p>
+        </w:tc>
+      </w:tr>
+      <w:tr>
+        <w:trPr/>
+        <w:tc>
+          <w:tcPr>
+            <w:tcBorders>
+              <w:top w:val="single" w:sz="1" w:space="0" w:color="000000"/>
+              <w:bottom w:val="single" w:sz="1" w:space="0" w:color="000000"/>
+              <w:left w:val="single" w:sz="1" w:space="0" w:color="000000"/>
+              <w:right w:val="single" w:sz="1" w:space="0" w:color="000000"/>
+            </w:tcBorders>
+          </w:tcPr>
+          <w:p>
+            <w:pPr>
+              <w:spacing w:lineRule="auto"/>
+            </w:pPr>
+            <w:r>
+              <w:rPr/>
+              <w:t xml:space="preserve">M2 20 emparejamientos concierge</w:t>
+            </w:r>
+          </w:p>
+        </w:tc>
+        <w:tc>
+          <w:tcPr>
+            <w:tcBorders>
+              <w:top w:val="single" w:sz="1" w:space="0" w:color="000000"/>
+              <w:bottom w:val="single" w:sz="1" w:space="0" w:color="000000"/>
+              <w:left w:val="single" w:sz="1" w:space="0" w:color="000000"/>
+              <w:right w:val="single" w:sz="1" w:space="0" w:color="000000"/>
+            </w:tcBorders>
+          </w:tcPr>
+          <w:p>
+            <w:pPr>
+              <w:spacing w:lineRule="auto"/>
+            </w:pPr>
+            <w:r>
+              <w:rPr/>
+              <w:t xml:space="preserve">09-ago-2026</w:t>
+            </w:r>
+          </w:p>
+        </w:tc>
+        <w:tc>
+          <w:tcPr>
+            <w:tcBorders>
+              <w:top w:val="single" w:sz="1" w:space="0" w:color="000000"/>
+              <w:bottom w:val="single" w:sz="1" w:space="0" w:color="000000"/>
+              <w:left w:val="single" w:sz="1" w:space="0" w:color="000000"/>
+              <w:right w:val="single" w:sz="1" w:space="0" w:color="000000"/>
+            </w:tcBorders>
+          </w:tcPr>
+          <w:p>
+            <w:pPr>
+              <w:spacing w:lineRule="auto"/>
+            </w:pPr>
+            <w:r>
+              <w:rPr/>
+              <w:t xml:space="preserve">Pendiente</w:t>
+            </w:r>
+          </w:p>
+        </w:tc>
+      </w:tr>
+      <w:tr>
+        <w:trPr/>
+        <w:tc>
+          <w:tcPr>
+            <w:tcBorders>
+              <w:top w:val="single" w:sz="1" w:space="0" w:color="000000"/>
+              <w:bottom w:val="single" w:sz="1" w:space="0" w:color="000000"/>
+              <w:left w:val="single" w:sz="1" w:space="0" w:color="000000"/>
+              <w:right w:val="single" w:sz="1" w:space="0" w:color="000000"/>
+            </w:tcBorders>
+          </w:tcPr>
+          <w:p>
+            <w:pPr>
+              <w:spacing w:lineRule="auto"/>
+            </w:pPr>
+            <w:r>
+              <w:rPr/>
+              <w:t xml:space="preserve">M3 MVP digital producción</w:t>
+            </w:r>
+          </w:p>
+        </w:tc>
+        <w:tc>
+          <w:tcPr>
+            <w:tcBorders>
+              <w:top w:val="single" w:sz="1" w:space="0" w:color="000000"/>
+              <w:bottom w:val="single" w:sz="1" w:space="0" w:color="000000"/>
+              <w:left w:val="single" w:sz="1" w:space="0" w:color="000000"/>
+              <w:right w:val="single" w:sz="1" w:space="0" w:color="000000"/>
+            </w:tcBorders>
+          </w:tcPr>
+          <w:p>
+            <w:pPr>
+              <w:spacing w:lineRule="auto"/>
+            </w:pPr>
+            <w:r>
+              <w:rPr/>
+              <w:t xml:space="preserve">25-oct-2026</w:t>
+            </w:r>
+          </w:p>
+        </w:tc>
+        <w:tc>
+          <w:tcPr>
+            <w:tcBorders>
+              <w:top w:val="single" w:sz="1" w:space="0" w:color="000000"/>
+              <w:bottom w:val="single" w:sz="1" w:space="0" w:color="000000"/>
+              <w:left w:val="single" w:sz="1" w:space="0" w:color="000000"/>
+              <w:right w:val="single" w:sz="1" w:space="0" w:color="000000"/>
+            </w:tcBorders>
+          </w:tcPr>
+          <w:p>
+            <w:pPr>
+              <w:spacing w:lineRule="auto"/>
+            </w:pPr>
+            <w:r>
+              <w:rPr>
+                <w:b/>
+              </w:rPr>
+              <w:t xml:space="preserve">Hecho (adelantado)</w:t>
+            </w:r>
+          </w:p>
+        </w:tc>
+      </w:tr>
+      <w:tr>
+        <w:trPr/>
+        <w:tc>
+          <w:tcPr>
+            <w:tcBorders>
+              <w:top w:val="single" w:sz="1" w:space="0" w:color="000000"/>
+              <w:bottom w:val="single" w:sz="1" w:space="0" w:color="000000"/>
+              <w:left w:val="single" w:sz="1" w:space="0" w:color="000000"/>
+              <w:right w:val="single" w:sz="1" w:space="0" w:color="000000"/>
+            </w:tcBorders>
+          </w:tcPr>
+          <w:p>
+            <w:pPr>
+              <w:spacing w:lineRule="auto"/>
+            </w:pPr>
+            <w:r>
+              <w:rPr/>
+              <w:t xml:space="preserve">M4 100 viajes digitales</w:t>
+            </w:r>
+          </w:p>
+        </w:tc>
+        <w:tc>
+          <w:tcPr>
+            <w:tcBorders>
+              <w:top w:val="single" w:sz="1" w:space="0" w:color="000000"/>
+              <w:bottom w:val="single" w:sz="1" w:space="0" w:color="000000"/>
+              <w:left w:val="single" w:sz="1" w:space="0" w:color="000000"/>
+              <w:right w:val="single" w:sz="1" w:space="0" w:color="000000"/>
+            </w:tcBorders>
+          </w:tcPr>
+          <w:p>
+            <w:pPr>
+              <w:spacing w:lineRule="auto"/>
+            </w:pPr>
+            <w:r>
+              <w:rPr/>
+              <w:t xml:space="preserve">31-ene-2027</w:t>
+            </w:r>
+          </w:p>
+        </w:tc>
+        <w:tc>
+          <w:tcPr>
+            <w:tcBorders>
+              <w:top w:val="single" w:sz="1" w:space="0" w:color="000000"/>
+              <w:bottom w:val="single" w:sz="1" w:space="0" w:color="000000"/>
+              <w:left w:val="single" w:sz="1" w:space="0" w:color="000000"/>
+              <w:right w:val="single" w:sz="1" w:space="0" w:color="000000"/>
+            </w:tcBorders>
+          </w:tcPr>
+          <w:p>
+            <w:pPr>
+              <w:spacing w:lineRule="auto"/>
+            </w:pPr>
+            <w:r>
+              <w:rPr/>
+              <w:t xml:space="preserve">Pendiente</w:t>
+            </w:r>
+          </w:p>
+        </w:tc>
+      </w:tr>
+      <w:tr>
+        <w:trPr/>
+        <w:tc>
+          <w:tcPr>
+            <w:tcBorders>
+              <w:top w:val="single" w:sz="1" w:space="0" w:color="000000"/>
+              <w:bottom w:val="single" w:sz="1" w:space="0" w:color="000000"/>
+              <w:left w:val="single" w:sz="1" w:space="0" w:color="000000"/>
+              <w:right w:val="single" w:sz="1" w:space="0" w:color="000000"/>
+            </w:tcBorders>
+          </w:tcPr>
+          <w:p>
+            <w:pPr>
+              <w:spacing w:lineRule="auto"/>
+            </w:pPr>
+            <w:r>
+              <w:rPr/>
+              <w:t xml:space="preserve">M5 Match semi-auto + SaaS</w:t>
+            </w:r>
+          </w:p>
+        </w:tc>
+        <w:tc>
+          <w:tcPr>
+            <w:tcBorders>
+              <w:top w:val="single" w:sz="1" w:space="0" w:color="000000"/>
+              <w:bottom w:val="single" w:sz="1" w:space="0" w:color="000000"/>
+              <w:left w:val="single" w:sz="1" w:space="0" w:color="000000"/>
+              <w:right w:val="single" w:sz="1" w:space="0" w:color="000000"/>
+            </w:tcBorders>
+          </w:tcPr>
+          <w:p>
+            <w:pPr>
+              <w:spacing w:lineRule="auto"/>
+            </w:pPr>
+            <w:r>
+              <w:rPr/>
+              <w:t xml:space="preserve">31-mar-2027</w:t>
+            </w:r>
+          </w:p>
+        </w:tc>
+        <w:tc>
+          <w:tcPr>
+            <w:tcBorders>
+              <w:top w:val="single" w:sz="1" w:space="0" w:color="000000"/>
+              <w:bottom w:val="single" w:sz="1" w:space="0" w:color="000000"/>
+              <w:left w:val="single" w:sz="1" w:space="0" w:color="000000"/>
+              <w:right w:val="single" w:sz="1" w:space="0" w:color="000000"/>
+            </w:tcBorders>
+          </w:tcPr>
+          <w:p>
+            <w:pPr>
+              <w:spacing w:lineRule="auto"/>
+            </w:pPr>
+            <w:r>
+              <w:rPr/>
+              <w:t xml:space="preserve">Pendiente</w:t>
+            </w:r>
+          </w:p>
+        </w:tc>
+      </w:tr>
+    </w:tbl>
+    <w:p>
+      <w:pPr>
+        <w:spacing w:lineRule="auto"/>
+      </w:pPr>
+      <w:r>
+        <w:rPr/>
+      </w:r>
+    </w:p>
+    <w:p>
+      <w:pPr>
+        <w:pStyle w:val="Heading3"/>
+        <w:spacing w:lineRule="auto"/>
+      </w:pPr>
+      <w:r>
+        <w:rPr/>
+        <w:t xml:space="preserve">12.2 Fase 2 digital — tareas vs plan</w:t>
+      </w:r>
+    </w:p>
+    <w:tbl>
+      <w:tblPr>
+        <w:tblBorders>
+          <w:top w:val="single" w:sz="1" w:space="0" w:color="000000"/>
+          <w:bottom w:val="single" w:sz="1" w:space="0" w:color="000000"/>
+          <w:left w:val="single" w:sz="1" w:space="0" w:color="000000"/>
+          <w:right w:val="single" w:sz="1" w:space="0" w:color="000000"/>
+        </w:tblBorders>
+        <w:tblCellSpacing w:w="0" w:type="dxa"/>
+        <w:tblCellMar>
+          <w:top w:type="dxa" w:w="80"/>
+          <w:bottom w:type="dxa" w:w="80"/>
+          <w:left w:type="dxa" w:w="160"/>
+          <w:right w:type="dxa" w:w="160"/>
+        </w:tblCellMar>
+        <w:jc w:val="center"/>
+      </w:tblPr>
+      <w:tblGrid>
+        <w:gridCol w:w="2160"/>
+        <w:gridCol w:w="2160"/>
+        <w:gridCol w:w="2160"/>
+        <w:gridCol w:w="2160"/>
+      </w:tblGrid>
+      <w:tr>
+        <w:trPr/>
+        <w:tc>
+          <w:tcPr>
+            <w:tcBorders>
+              <w:top w:val="single" w:sz="1" w:space="0" w:color="000000"/>
+              <w:bottom w:val="single" w:sz="1" w:space="0" w:color="000000"/>
+              <w:left w:val="single" w:sz="1" w:space="0" w:color="000000"/>
+              <w:right w:val="single" w:sz="1" w:space="0" w:color="000000"/>
+            </w:tcBorders>
+          </w:tcPr>
+          <w:p>
+            <w:pPr>
+              <w:spacing w:lineRule="auto"/>
+            </w:pPr>
+            <w:r>
+              <w:rPr/>
+              <w:t xml:space="preserve">ID</w:t>
+            </w:r>
+          </w:p>
+        </w:tc>
+        <w:tc>
+          <w:tcPr>
+            <w:tcBorders>
+              <w:top w:val="single" w:sz="1" w:space="0" w:color="000000"/>
+              <w:bottom w:val="single" w:sz="1" w:space="0" w:color="000000"/>
+              <w:left w:val="single" w:sz="1" w:space="0" w:color="000000"/>
+              <w:right w:val="single" w:sz="1" w:space="0" w:color="000000"/>
+            </w:tcBorders>
+          </w:tcPr>
+          <w:p>
+            <w:pPr>
+              <w:spacing w:lineRule="auto"/>
+            </w:pPr>
+            <w:r>
+              <w:rPr/>
+              <w:t xml:space="preserve">Tarea</w:t>
+            </w:r>
+          </w:p>
+        </w:tc>
+        <w:tc>
+          <w:tcPr>
+            <w:tcBorders>
+              <w:top w:val="single" w:sz="1" w:space="0" w:color="000000"/>
+              <w:bottom w:val="single" w:sz="1" w:space="0" w:color="000000"/>
+              <w:left w:val="single" w:sz="1" w:space="0" w:color="000000"/>
+              <w:right w:val="single" w:sz="1" w:space="0" w:color="000000"/>
+            </w:tcBorders>
+          </w:tcPr>
+          <w:p>
+            <w:pPr>
+              <w:spacing w:lineRule="auto"/>
+            </w:pPr>
+            <w:r>
+              <w:rPr/>
+              <w:t xml:space="preserve">Plan Gantt</w:t>
+            </w:r>
+          </w:p>
+        </w:tc>
+        <w:tc>
+          <w:tcPr>
+            <w:tcBorders>
+              <w:top w:val="single" w:sz="1" w:space="0" w:color="000000"/>
+              <w:bottom w:val="single" w:sz="1" w:space="0" w:color="000000"/>
+              <w:left w:val="single" w:sz="1" w:space="0" w:color="000000"/>
+              <w:right w:val="single" w:sz="1" w:space="0" w:color="000000"/>
+            </w:tcBorders>
+          </w:tcPr>
+          <w:p>
+            <w:pPr>
+              <w:spacing w:lineRule="auto"/>
+            </w:pPr>
+            <w:r>
+              <w:rPr/>
+              <w:t xml:space="preserve">Estado</w:t>
+            </w:r>
+          </w:p>
+        </w:tc>
+      </w:tr>
+      <w:tr>
+        <w:trPr/>
+        <w:tc>
+          <w:tcPr>
+            <w:tcBorders>
+              <w:top w:val="single" w:sz="1" w:space="0" w:color="000000"/>
+              <w:bottom w:val="single" w:sz="1" w:space="0" w:color="000000"/>
+              <w:left w:val="single" w:sz="1" w:space="0" w:color="000000"/>
+              <w:right w:val="single" w:sz="1" w:space="0" w:color="000000"/>
+            </w:tcBorders>
+          </w:tcPr>
+          <w:p>
+            <w:pPr>
+              <w:spacing w:lineRule="auto"/>
+            </w:pPr>
+            <w:r>
+              <w:rPr/>
+              <w:t xml:space="preserve">2.1</w:t>
+            </w:r>
+          </w:p>
+        </w:tc>
+        <w:tc>
+          <w:tcPr>
+            <w:tcBorders>
+              <w:top w:val="single" w:sz="1" w:space="0" w:color="000000"/>
+              <w:bottom w:val="single" w:sz="1" w:space="0" w:color="000000"/>
+              <w:left w:val="single" w:sz="1" w:space="0" w:color="000000"/>
+              <w:right w:val="single" w:sz="1" w:space="0" w:color="000000"/>
+            </w:tcBorders>
+          </w:tcPr>
+          <w:p>
+            <w:pPr>
+              <w:spacing w:lineRule="auto"/>
+            </w:pPr>
+            <w:r>
+              <w:rPr/>
+              <w:t xml:space="preserve">Esquema BD Supabase</w:t>
+            </w:r>
+          </w:p>
+        </w:tc>
+        <w:tc>
+          <w:tcPr>
+            <w:tcBorders>
+              <w:top w:val="single" w:sz="1" w:space="0" w:color="000000"/>
+              <w:bottom w:val="single" w:sz="1" w:space="0" w:color="000000"/>
+              <w:left w:val="single" w:sz="1" w:space="0" w:color="000000"/>
+              <w:right w:val="single" w:sz="1" w:space="0" w:color="000000"/>
+            </w:tcBorders>
+          </w:tcPr>
+          <w:p>
+            <w:pPr>
+              <w:spacing w:lineRule="auto"/>
+            </w:pPr>
+            <w:r>
+              <w:rPr/>
+              <w:t xml:space="preserve">ago 2026</w:t>
+            </w:r>
+          </w:p>
+        </w:tc>
+        <w:tc>
+          <w:tcPr>
+            <w:tcBorders>
+              <w:top w:val="single" w:sz="1" w:space="0" w:color="000000"/>
+              <w:bottom w:val="single" w:sz="1" w:space="0" w:color="000000"/>
+              <w:left w:val="single" w:sz="1" w:space="0" w:color="000000"/>
+              <w:right w:val="single" w:sz="1" w:space="0" w:color="000000"/>
+            </w:tcBorders>
+          </w:tcPr>
+          <w:p>
+            <w:pPr>
+              <w:spacing w:lineRule="auto"/>
+            </w:pPr>
+            <w:r>
+              <w:rPr/>
+              <w:t xml:space="preserve">Hecho (001–008)</w:t>
+            </w:r>
+          </w:p>
+        </w:tc>
+      </w:tr>
+      <w:tr>
+        <w:trPr/>
+        <w:tc>
+          <w:tcPr>
+            <w:tcBorders>
+              <w:top w:val="single" w:sz="1" w:space="0" w:color="000000"/>
+              <w:bottom w:val="single" w:sz="1" w:space="0" w:color="000000"/>
+              <w:left w:val="single" w:sz="1" w:space="0" w:color="000000"/>
+              <w:right w:val="single" w:sz="1" w:space="0" w:color="000000"/>
+            </w:tcBorders>
+          </w:tcPr>
+          <w:p>
+            <w:pPr>
+              <w:spacing w:lineRule="auto"/>
+            </w:pPr>
+            <w:r>
+              <w:rPr/>
+              <w:t xml:space="preserve">2.2</w:t>
+            </w:r>
+          </w:p>
+        </w:tc>
+        <w:tc>
+          <w:tcPr>
+            <w:tcBorders>
+              <w:top w:val="single" w:sz="1" w:space="0" w:color="000000"/>
+              <w:bottom w:val="single" w:sz="1" w:space="0" w:color="000000"/>
+              <w:left w:val="single" w:sz="1" w:space="0" w:color="000000"/>
+              <w:right w:val="single" w:sz="1" w:space="0" w:color="000000"/>
+            </w:tcBorders>
+          </w:tcPr>
+          <w:p>
+            <w:pPr>
+              <w:spacing w:lineRule="auto"/>
+            </w:pPr>
+            <w:r>
+              <w:rPr/>
+              <w:t xml:space="preserve">API Express</w:t>
+            </w:r>
+          </w:p>
+        </w:tc>
+        <w:tc>
+          <w:tcPr>
+            <w:tcBorders>
+              <w:top w:val="single" w:sz="1" w:space="0" w:color="000000"/>
+              <w:bottom w:val="single" w:sz="1" w:space="0" w:color="000000"/>
+              <w:left w:val="single" w:sz="1" w:space="0" w:color="000000"/>
+              <w:right w:val="single" w:sz="1" w:space="0" w:color="000000"/>
+            </w:tcBorders>
+          </w:tcPr>
+          <w:p>
+            <w:pPr>
+              <w:spacing w:lineRule="auto"/>
+            </w:pPr>
+            <w:r>
+              <w:rPr/>
+              <w:t xml:space="preserve">ago–sep 2026</w:t>
+            </w:r>
+          </w:p>
+        </w:tc>
+        <w:tc>
+          <w:tcPr>
+            <w:tcBorders>
+              <w:top w:val="single" w:sz="1" w:space="0" w:color="000000"/>
+              <w:bottom w:val="single" w:sz="1" w:space="0" w:color="000000"/>
+              <w:left w:val="single" w:sz="1" w:space="0" w:color="000000"/>
+              <w:right w:val="single" w:sz="1" w:space="0" w:color="000000"/>
+            </w:tcBorders>
+          </w:tcPr>
+          <w:p>
+            <w:pPr>
+              <w:spacing w:lineRule="auto"/>
+            </w:pPr>
+            <w:r>
+              <w:rPr/>
+              <w:t xml:space="preserve">Hecho</w:t>
+            </w:r>
+          </w:p>
+        </w:tc>
+      </w:tr>
+      <w:tr>
+        <w:trPr/>
+        <w:tc>
+          <w:tcPr>
+            <w:tcBorders>
+              <w:top w:val="single" w:sz="1" w:space="0" w:color="000000"/>
+              <w:bottom w:val="single" w:sz="1" w:space="0" w:color="000000"/>
+              <w:left w:val="single" w:sz="1" w:space="0" w:color="000000"/>
+              <w:right w:val="single" w:sz="1" w:space="0" w:color="000000"/>
+            </w:tcBorders>
+          </w:tcPr>
+          <w:p>
+            <w:pPr>
+              <w:spacing w:lineRule="auto"/>
+            </w:pPr>
+            <w:r>
+              <w:rPr/>
+              <w:t xml:space="preserve">2.3</w:t>
+            </w:r>
+          </w:p>
+        </w:tc>
+        <w:tc>
+          <w:tcPr>
+            <w:tcBorders>
+              <w:top w:val="single" w:sz="1" w:space="0" w:color="000000"/>
+              <w:bottom w:val="single" w:sz="1" w:space="0" w:color="000000"/>
+              <w:left w:val="single" w:sz="1" w:space="0" w:color="000000"/>
+              <w:right w:val="single" w:sz="1" w:space="0" w:color="000000"/>
+            </w:tcBorders>
+          </w:tcPr>
+          <w:p>
+            <w:pPr>
+              <w:spacing w:lineRule="auto"/>
+            </w:pPr>
+            <w:r>
+              <w:rPr/>
+              <w:t xml:space="preserve">Web embarcador / transportista</w:t>
+            </w:r>
+          </w:p>
+        </w:tc>
+        <w:tc>
+          <w:tcPr>
+            <w:tcBorders>
+              <w:top w:val="single" w:sz="1" w:space="0" w:color="000000"/>
+              <w:bottom w:val="single" w:sz="1" w:space="0" w:color="000000"/>
+              <w:left w:val="single" w:sz="1" w:space="0" w:color="000000"/>
+              <w:right w:val="single" w:sz="1" w:space="0" w:color="000000"/>
+            </w:tcBorders>
+          </w:tcPr>
+          <w:p>
+            <w:pPr>
+              <w:spacing w:lineRule="auto"/>
+            </w:pPr>
+            <w:r>
+              <w:rPr/>
+              <w:t xml:space="preserve">sep–oct 2026</w:t>
+            </w:r>
+          </w:p>
+        </w:tc>
+        <w:tc>
+          <w:tcPr>
+            <w:tcBorders>
+              <w:top w:val="single" w:sz="1" w:space="0" w:color="000000"/>
+              <w:bottom w:val="single" w:sz="1" w:space="0" w:color="000000"/>
+              <w:left w:val="single" w:sz="1" w:space="0" w:color="000000"/>
+              <w:right w:val="single" w:sz="1" w:space="0" w:color="000000"/>
+            </w:tcBorders>
+          </w:tcPr>
+          <w:p>
+            <w:pPr>
+              <w:spacing w:lineRule="auto"/>
+            </w:pPr>
+            <w:r>
+              <w:rPr/>
+              <w:t xml:space="preserve">Hecho v0.0.19</w:t>
+            </w:r>
+          </w:p>
+        </w:tc>
+      </w:tr>
+      <w:tr>
+        <w:trPr/>
+        <w:tc>
+          <w:tcPr>
+            <w:tcBorders>
+              <w:top w:val="single" w:sz="1" w:space="0" w:color="000000"/>
+              <w:bottom w:val="single" w:sz="1" w:space="0" w:color="000000"/>
+              <w:left w:val="single" w:sz="1" w:space="0" w:color="000000"/>
+              <w:right w:val="single" w:sz="1" w:space="0" w:color="000000"/>
+            </w:tcBorders>
+          </w:tcPr>
+          <w:p>
+            <w:pPr>
+              <w:spacing w:lineRule="auto"/>
+            </w:pPr>
+            <w:r>
+              <w:rPr/>
+              <w:t xml:space="preserve">2.4</w:t>
+            </w:r>
+          </w:p>
+        </w:tc>
+        <w:tc>
+          <w:tcPr>
+            <w:tcBorders>
+              <w:top w:val="single" w:sz="1" w:space="0" w:color="000000"/>
+              <w:bottom w:val="single" w:sz="1" w:space="0" w:color="000000"/>
+              <w:left w:val="single" w:sz="1" w:space="0" w:color="000000"/>
+              <w:right w:val="single" w:sz="1" w:space="0" w:color="000000"/>
+            </w:tcBorders>
+          </w:tcPr>
+          <w:p>
+            <w:pPr>
+              <w:spacing w:lineRule="auto"/>
+            </w:pPr>
+            <w:r>
+              <w:rPr/>
+              <w:t xml:space="preserve">Panel / estados viaje</w:t>
+            </w:r>
+          </w:p>
+        </w:tc>
+        <w:tc>
+          <w:tcPr>
+            <w:tcBorders>
+              <w:top w:val="single" w:sz="1" w:space="0" w:color="000000"/>
+              <w:bottom w:val="single" w:sz="1" w:space="0" w:color="000000"/>
+              <w:left w:val="single" w:sz="1" w:space="0" w:color="000000"/>
+              <w:right w:val="single" w:sz="1" w:space="0" w:color="000000"/>
+            </w:tcBorders>
+          </w:tcPr>
+          <w:p>
+            <w:pPr>
+              <w:spacing w:lineRule="auto"/>
+            </w:pPr>
+            <w:r>
+              <w:rPr/>
+              <w:t xml:space="preserve">sep–oct 2026</w:t>
+            </w:r>
+          </w:p>
+        </w:tc>
+        <w:tc>
+          <w:tcPr>
+            <w:tcBorders>
+              <w:top w:val="single" w:sz="1" w:space="0" w:color="000000"/>
+              <w:bottom w:val="single" w:sz="1" w:space="0" w:color="000000"/>
+              <w:left w:val="single" w:sz="1" w:space="0" w:color="000000"/>
+              <w:right w:val="single" w:sz="1" w:space="0" w:color="000000"/>
+            </w:tcBorders>
+          </w:tcPr>
+          <w:p>
+            <w:pPr>
+              <w:spacing w:lineRule="auto"/>
+            </w:pPr>
+            <w:r>
+              <w:rPr/>
+              <w:t xml:space="preserve">Hecho</w:t>
+            </w:r>
+          </w:p>
+        </w:tc>
+      </w:tr>
+      <w:tr>
+        <w:trPr/>
+        <w:tc>
+          <w:tcPr>
+            <w:tcBorders>
+              <w:top w:val="single" w:sz="1" w:space="0" w:color="000000"/>
+              <w:bottom w:val="single" w:sz="1" w:space="0" w:color="000000"/>
+              <w:left w:val="single" w:sz="1" w:space="0" w:color="000000"/>
+              <w:right w:val="single" w:sz="1" w:space="0" w:color="000000"/>
+            </w:tcBorders>
+          </w:tcPr>
+          <w:p>
+            <w:pPr>
+              <w:spacing w:lineRule="auto"/>
+            </w:pPr>
+            <w:r>
+              <w:rPr/>
+              <w:t xml:space="preserve">2.5</w:t>
+            </w:r>
+          </w:p>
+        </w:tc>
+        <w:tc>
+          <w:tcPr>
+            <w:tcBorders>
+              <w:top w:val="single" w:sz="1" w:space="0" w:color="000000"/>
+              <w:bottom w:val="single" w:sz="1" w:space="0" w:color="000000"/>
+              <w:left w:val="single" w:sz="1" w:space="0" w:color="000000"/>
+              <w:right w:val="single" w:sz="1" w:space="0" w:color="000000"/>
+            </w:tcBorders>
+          </w:tcPr>
+          <w:p>
+            <w:pPr>
+              <w:spacing w:lineRule="auto"/>
+            </w:pPr>
+            <w:r>
+              <w:rPr/>
+              <w:t xml:space="preserve">Deploy Railway</w:t>
+            </w:r>
+          </w:p>
+        </w:tc>
+        <w:tc>
+          <w:tcPr>
+            <w:tcBorders>
+              <w:top w:val="single" w:sz="1" w:space="0" w:color="000000"/>
+              <w:bottom w:val="single" w:sz="1" w:space="0" w:color="000000"/>
+              <w:left w:val="single" w:sz="1" w:space="0" w:color="000000"/>
+              <w:right w:val="single" w:sz="1" w:space="0" w:color="000000"/>
+            </w:tcBorders>
+          </w:tcPr>
+          <w:p>
+            <w:pPr>
+              <w:spacing w:lineRule="auto"/>
+            </w:pPr>
+            <w:r>
+              <w:rPr/>
+              <w:t xml:space="preserve">oct 2026</w:t>
+            </w:r>
+          </w:p>
+        </w:tc>
+        <w:tc>
+          <w:tcPr>
+            <w:tcBorders>
+              <w:top w:val="single" w:sz="1" w:space="0" w:color="000000"/>
+              <w:bottom w:val="single" w:sz="1" w:space="0" w:color="000000"/>
+              <w:left w:val="single" w:sz="1" w:space="0" w:color="000000"/>
+              <w:right w:val="single" w:sz="1" w:space="0" w:color="000000"/>
+            </w:tcBorders>
+          </w:tcPr>
+          <w:p>
+            <w:pPr>
+              <w:spacing w:lineRule="auto"/>
+            </w:pPr>
+            <w:r>
+              <w:rPr/>
+              <w:t xml:space="preserve">Hecho</w:t>
+            </w:r>
+          </w:p>
+        </w:tc>
+      </w:tr>
+      <w:tr>
+        <w:trPr/>
+        <w:tc>
+          <w:tcPr>
+            <w:tcBorders>
+              <w:top w:val="single" w:sz="1" w:space="0" w:color="000000"/>
+              <w:bottom w:val="single" w:sz="1" w:space="0" w:color="000000"/>
+              <w:left w:val="single" w:sz="1" w:space="0" w:color="000000"/>
+              <w:right w:val="single" w:sz="1" w:space="0" w:color="000000"/>
+            </w:tcBorders>
+          </w:tcPr>
+          <w:p>
+            <w:pPr>
+              <w:spacing w:lineRule="auto"/>
+            </w:pPr>
+            <w:r>
+              <w:rPr/>
+              <w:t xml:space="preserve">—</w:t>
+            </w:r>
+          </w:p>
+        </w:tc>
+        <w:tc>
+          <w:tcPr>
+            <w:tcBorders>
+              <w:top w:val="single" w:sz="1" w:space="0" w:color="000000"/>
+              <w:bottom w:val="single" w:sz="1" w:space="0" w:color="000000"/>
+              <w:left w:val="single" w:sz="1" w:space="0" w:color="000000"/>
+              <w:right w:val="single" w:sz="1" w:space="0" w:color="000000"/>
+            </w:tcBorders>
+          </w:tcPr>
+          <w:p>
+            <w:pPr>
+              <w:spacing w:lineRule="auto"/>
+            </w:pPr>
+            <w:r>
+              <w:rPr/>
+              <w:t xml:space="preserve">Chat, acuerdo mutuo, notificaciones, multas UI</w:t>
+            </w:r>
+          </w:p>
+        </w:tc>
+        <w:tc>
+          <w:tcPr>
+            <w:tcBorders>
+              <w:top w:val="single" w:sz="1" w:space="0" w:color="000000"/>
+              <w:bottom w:val="single" w:sz="1" w:space="0" w:color="000000"/>
+              <w:left w:val="single" w:sz="1" w:space="0" w:color="000000"/>
+              <w:right w:val="single" w:sz="1" w:space="0" w:color="000000"/>
+            </w:tcBorders>
+          </w:tcPr>
+          <w:p>
+            <w:pPr>
+              <w:spacing w:lineRule="auto"/>
+            </w:pPr>
+            <w:r>
+              <w:rPr/>
+              <w:t xml:space="preserve">extra MVP</w:t>
+            </w:r>
+          </w:p>
+        </w:tc>
+        <w:tc>
+          <w:tcPr>
+            <w:tcBorders>
+              <w:top w:val="single" w:sz="1" w:space="0" w:color="000000"/>
+              <w:bottom w:val="single" w:sz="1" w:space="0" w:color="000000"/>
+              <w:left w:val="single" w:sz="1" w:space="0" w:color="000000"/>
+              <w:right w:val="single" w:sz="1" w:space="0" w:color="000000"/>
+            </w:tcBorders>
+          </w:tcPr>
+          <w:p>
+            <w:pPr>
+              <w:spacing w:lineRule="auto"/>
+            </w:pPr>
+            <w:r>
+              <w:rPr/>
+              <w:t xml:space="preserve">Hecho</w:t>
+            </w:r>
+          </w:p>
+        </w:tc>
+      </w:tr>
+      <w:tr>
+        <w:trPr/>
+        <w:tc>
+          <w:tcPr>
+            <w:tcBorders>
+              <w:top w:val="single" w:sz="1" w:space="0" w:color="000000"/>
+              <w:bottom w:val="single" w:sz="1" w:space="0" w:color="000000"/>
+              <w:left w:val="single" w:sz="1" w:space="0" w:color="000000"/>
+              <w:right w:val="single" w:sz="1" w:space="0" w:color="000000"/>
+            </w:tcBorders>
+          </w:tcPr>
+          <w:p>
+            <w:pPr>
+              <w:spacing w:lineRule="auto"/>
+            </w:pPr>
+            <w:r>
+              <w:rPr/>
+              <w:t xml:space="preserve">2.10</w:t>
+            </w:r>
+          </w:p>
+        </w:tc>
+        <w:tc>
+          <w:tcPr>
+            <w:tcBorders>
+              <w:top w:val="single" w:sz="1" w:space="0" w:color="000000"/>
+              <w:bottom w:val="single" w:sz="1" w:space="0" w:color="000000"/>
+              <w:left w:val="single" w:sz="1" w:space="0" w:color="000000"/>
+              <w:right w:val="single" w:sz="1" w:space="0" w:color="000000"/>
+            </w:tcBorders>
+          </w:tcPr>
+          <w:p>
+            <w:pPr>
+              <w:spacing w:lineRule="auto"/>
+            </w:pPr>
+            <w:r>
+              <w:rPr/>
+              <w:t xml:space="preserve">Cuenta bancaria + cobro</w:t>
+            </w:r>
+          </w:p>
+        </w:tc>
+        <w:tc>
+          <w:tcPr>
+            <w:tcBorders>
+              <w:top w:val="single" w:sz="1" w:space="0" w:color="000000"/>
+              <w:bottom w:val="single" w:sz="1" w:space="0" w:color="000000"/>
+              <w:left w:val="single" w:sz="1" w:space="0" w:color="000000"/>
+              <w:right w:val="single" w:sz="1" w:space="0" w:color="000000"/>
+            </w:tcBorders>
+          </w:tcPr>
+          <w:p>
+            <w:pPr>
+              <w:spacing w:lineRule="auto"/>
+            </w:pPr>
+            <w:r>
+              <w:rPr/>
+              <w:t xml:space="preserve">roadmap</w:t>
+            </w:r>
+          </w:p>
+        </w:tc>
+        <w:tc>
+          <w:tcPr>
+            <w:tcBorders>
+              <w:top w:val="single" w:sz="1" w:space="0" w:color="000000"/>
+              <w:bottom w:val="single" w:sz="1" w:space="0" w:color="000000"/>
+              <w:left w:val="single" w:sz="1" w:space="0" w:color="000000"/>
+              <w:right w:val="single" w:sz="1" w:space="0" w:color="000000"/>
+            </w:tcBorders>
+          </w:tcPr>
+          <w:p>
+            <w:pPr>
+              <w:spacing w:lineRule="auto"/>
+            </w:pPr>
+            <w:r>
+              <w:rPr/>
+              <w:t xml:space="preserve">UI/API sin pasarela</w:t>
+            </w:r>
+          </w:p>
+        </w:tc>
+      </w:tr>
+    </w:tbl>
+    <w:p>
+      <w:pPr>
+        <w:spacing w:lineRule="auto"/>
+      </w:pPr>
+      <w:r>
+        <w:rPr/>
+      </w:r>
+    </w:p>
+    <w:p>
+      <w:pPr>
+        <w:pStyle w:val="Heading3"/>
+        <w:spacing w:lineRule="auto"/>
+      </w:pPr>
+      <w:r>
+        <w:rPr/>
+        <w:t xml:space="preserve">12.3 Avance estimado</w:t>
       </w:r>
     </w:p>
     <w:p>
@@ -2151,7 +4811,7 @@
       </w:pPr>
       <w:r>
         <w:rPr/>
-        <w:t xml:space="preserve">Informe_Evaluacion_Estrategica_Uber_Truck.docx</w:t>
+        <w:t xml:space="preserve">Fase 2 MVP digital núcleo: ~75%</w:t>
       </w:r>
     </w:p>
     <w:p>
@@ -2164,7 +4824,7 @@
       </w:pPr>
       <w:r>
         <w:rPr/>
-        <w:t xml:space="preserve">docs/Journey-Usuario-Uber-Truck.html</w:t>
+        <w:t xml:space="preserve">Fase 2.10 multas/cobros: ~25%</w:t>
       </w:r>
     </w:p>
     <w:p>
@@ -2177,7 +4837,481 @@
       </w:pPr>
       <w:r>
         <w:rPr/>
-        <w:t xml:space="preserve">docs/Gantt-Uber-Truck.html</w:t>
+        <w:t xml:space="preserve">Proyecto total (hasta M5): ~35%</w:t>
+      </w:r>
+    </w:p>
+    <w:p>
+      <w:pPr>
+        <w:spacing w:lineRule="auto"/>
+      </w:pPr>
+      <w:r>
+        <w:rPr/>
+        <w:t xml:space="preserve">Visualización: </w:t>
+      </w:r>
+      <w:hyperlink r:id="rId11">
+        <w:r>
+          <w:rPr>
+            <w:rStyle w:val="Hyperlink"/>
+          </w:rPr>
+          <w:t xml:space="preserve">Canvas-Resumen-Uber-Truck.html</w:t>
+        </w:r>
+      </w:hyperlink>
+      <w:r>
+        <w:rPr/>
+        <w:t xml:space="preserve"> · canvas </w:t>
+      </w:r>
+      <w:r>
+        <w:rPr/>
+        <w:t xml:space="preserve">estado-avance.canvas.tsx</w:t>
+      </w:r>
+      <w:r>
+        <w:rPr/>
+        <w:t xml:space="preserve"> en Cursor.</w:t>
+      </w:r>
+    </w:p>
+    <w:p>
+      <w:pPr>
+        <w:pStyle w:val="Heading3"/>
+        <w:spacing w:lineRule="auto"/>
+      </w:pPr>
+      <w:r>
+        <w:rPr/>
+        <w:t xml:space="preserve">12.4 Próximos pasos (backlog)</w:t>
+      </w:r>
+    </w:p>
+    <w:p>
+      <w:pPr>
+        <w:spacing w:lineRule="auto"/>
+      </w:pPr>
+      <w:r>
+        <w:rPr/>
+        <w:t xml:space="preserve">Tabla operativa completa: </w:t>
+      </w:r>
+      <w:r>
+        <w:rPr/>
+        <w:t xml:space="preserve">docs/PROXIMOS-HITOS.md</w:t>
+      </w:r>
+      <w:r>
+        <w:rPr/>
+        <w:t xml:space="preserve">. Comparación con estructura Chanchi: </w:t>
+      </w:r>
+      <w:r>
+        <w:rPr/>
+        <w:t xml:space="preserve">docs/COMPARACION-ESTRUCTURA-CHANCHI.md</w:t>
+      </w:r>
+      <w:r>
+        <w:rPr/>
+        <w:t xml:space="preserve">.</w:t>
+      </w:r>
+    </w:p>
+    <w:p>
+      <w:pPr>
+        <w:pStyle w:val="Heading2"/>
+        <w:spacing w:lineRule="auto"/>
+      </w:pPr>
+      <w:r>
+        <w:rPr/>
+        <w:t xml:space="preserve">13. API ampliada (v0.0.19)</w:t>
+      </w:r>
+    </w:p>
+    <w:tbl>
+      <w:tblPr>
+        <w:tblBorders>
+          <w:top w:val="single" w:sz="1" w:space="0" w:color="000000"/>
+          <w:bottom w:val="single" w:sz="1" w:space="0" w:color="000000"/>
+          <w:left w:val="single" w:sz="1" w:space="0" w:color="000000"/>
+          <w:right w:val="single" w:sz="1" w:space="0" w:color="000000"/>
+        </w:tblBorders>
+        <w:tblCellSpacing w:w="0" w:type="dxa"/>
+        <w:tblCellMar>
+          <w:top w:type="dxa" w:w="80"/>
+          <w:bottom w:type="dxa" w:w="80"/>
+          <w:left w:type="dxa" w:w="160"/>
+          <w:right w:type="dxa" w:w="160"/>
+        </w:tblCellMar>
+        <w:jc w:val="center"/>
+      </w:tblPr>
+      <w:tblGrid>
+        <w:gridCol w:w="2880"/>
+        <w:gridCol w:w="2880"/>
+        <w:gridCol w:w="2880"/>
+      </w:tblGrid>
+      <w:tr>
+        <w:trPr/>
+        <w:tc>
+          <w:tcPr>
+            <w:tcBorders>
+              <w:top w:val="single" w:sz="1" w:space="0" w:color="000000"/>
+              <w:bottom w:val="single" w:sz="1" w:space="0" w:color="000000"/>
+              <w:left w:val="single" w:sz="1" w:space="0" w:color="000000"/>
+              <w:right w:val="single" w:sz="1" w:space="0" w:color="000000"/>
+            </w:tcBorders>
+          </w:tcPr>
+          <w:p>
+            <w:pPr>
+              <w:spacing w:lineRule="auto"/>
+            </w:pPr>
+            <w:r>
+              <w:rPr/>
+              <w:t xml:space="preserve">Método</w:t>
+            </w:r>
+          </w:p>
+        </w:tc>
+        <w:tc>
+          <w:tcPr>
+            <w:tcBorders>
+              <w:top w:val="single" w:sz="1" w:space="0" w:color="000000"/>
+              <w:bottom w:val="single" w:sz="1" w:space="0" w:color="000000"/>
+              <w:left w:val="single" w:sz="1" w:space="0" w:color="000000"/>
+              <w:right w:val="single" w:sz="1" w:space="0" w:color="000000"/>
+            </w:tcBorders>
+          </w:tcPr>
+          <w:p>
+            <w:pPr>
+              <w:spacing w:lineRule="auto"/>
+            </w:pPr>
+            <w:r>
+              <w:rPr/>
+              <w:t xml:space="preserve">Ruta</w:t>
+            </w:r>
+          </w:p>
+        </w:tc>
+        <w:tc>
+          <w:tcPr>
+            <w:tcBorders>
+              <w:top w:val="single" w:sz="1" w:space="0" w:color="000000"/>
+              <w:bottom w:val="single" w:sz="1" w:space="0" w:color="000000"/>
+              <w:left w:val="single" w:sz="1" w:space="0" w:color="000000"/>
+              <w:right w:val="single" w:sz="1" w:space="0" w:color="000000"/>
+            </w:tcBorders>
+          </w:tcPr>
+          <w:p>
+            <w:pPr>
+              <w:spacing w:lineRule="auto"/>
+            </w:pPr>
+            <w:r>
+              <w:rPr/>
+              <w:t xml:space="preserve">Descripción</w:t>
+            </w:r>
+          </w:p>
+        </w:tc>
+      </w:tr>
+      <w:tr>
+        <w:trPr/>
+        <w:tc>
+          <w:tcPr>
+            <w:tcBorders>
+              <w:top w:val="single" w:sz="1" w:space="0" w:color="000000"/>
+              <w:bottom w:val="single" w:sz="1" w:space="0" w:color="000000"/>
+              <w:left w:val="single" w:sz="1" w:space="0" w:color="000000"/>
+              <w:right w:val="single" w:sz="1" w:space="0" w:color="000000"/>
+            </w:tcBorders>
+          </w:tcPr>
+          <w:p>
+            <w:pPr>
+              <w:spacing w:lineRule="auto"/>
+            </w:pPr>
+            <w:r>
+              <w:rPr/>
+              <w:t xml:space="preserve">POST</w:t>
+            </w:r>
+          </w:p>
+        </w:tc>
+        <w:tc>
+          <w:tcPr>
+            <w:tcBorders>
+              <w:top w:val="single" w:sz="1" w:space="0" w:color="000000"/>
+              <w:bottom w:val="single" w:sz="1" w:space="0" w:color="000000"/>
+              <w:left w:val="single" w:sz="1" w:space="0" w:color="000000"/>
+              <w:right w:val="single" w:sz="1" w:space="0" w:color="000000"/>
+            </w:tcBorders>
+          </w:tcPr>
+          <w:p>
+            <w:pPr>
+              <w:spacing w:lineRule="auto"/>
+            </w:pPr>
+            <w:r>
+              <w:rPr/>
+              <w:t xml:space="preserve">/api/matches/:id/mutual-cancel</w:t>
+            </w:r>
+          </w:p>
+        </w:tc>
+        <w:tc>
+          <w:tcPr>
+            <w:tcBorders>
+              <w:top w:val="single" w:sz="1" w:space="0" w:color="000000"/>
+              <w:bottom w:val="single" w:sz="1" w:space="0" w:color="000000"/>
+              <w:left w:val="single" w:sz="1" w:space="0" w:color="000000"/>
+              <w:right w:val="single" w:sz="1" w:space="0" w:color="000000"/>
+            </w:tcBorders>
+          </w:tcPr>
+          <w:p>
+            <w:pPr>
+              <w:spacing w:lineRule="auto"/>
+            </w:pPr>
+            <w:r>
+              <w:rPr/>
+              <w:t xml:space="preserve">Confirmar acuerdo mutuo</w:t>
+            </w:r>
+          </w:p>
+        </w:tc>
+      </w:tr>
+      <w:tr>
+        <w:trPr/>
+        <w:tc>
+          <w:tcPr>
+            <w:tcBorders>
+              <w:top w:val="single" w:sz="1" w:space="0" w:color="000000"/>
+              <w:bottom w:val="single" w:sz="1" w:space="0" w:color="000000"/>
+              <w:left w:val="single" w:sz="1" w:space="0" w:color="000000"/>
+              <w:right w:val="single" w:sz="1" w:space="0" w:color="000000"/>
+            </w:tcBorders>
+          </w:tcPr>
+          <w:p>
+            <w:pPr>
+              <w:spacing w:lineRule="auto"/>
+            </w:pPr>
+            <w:r>
+              <w:rPr/>
+              <w:t xml:space="preserve">GET</w:t>
+            </w:r>
+          </w:p>
+        </w:tc>
+        <w:tc>
+          <w:tcPr>
+            <w:tcBorders>
+              <w:top w:val="single" w:sz="1" w:space="0" w:color="000000"/>
+              <w:bottom w:val="single" w:sz="1" w:space="0" w:color="000000"/>
+              <w:left w:val="single" w:sz="1" w:space="0" w:color="000000"/>
+              <w:right w:val="single" w:sz="1" w:space="0" w:color="000000"/>
+            </w:tcBorders>
+          </w:tcPr>
+          <w:p>
+            <w:pPr>
+              <w:spacing w:lineRule="auto"/>
+            </w:pPr>
+            <w:r>
+              <w:rPr/>
+              <w:t xml:space="preserve">/api/matches/cancel-options</w:t>
+            </w:r>
+          </w:p>
+        </w:tc>
+        <w:tc>
+          <w:tcPr>
+            <w:tcBorders>
+              <w:top w:val="single" w:sz="1" w:space="0" w:color="000000"/>
+              <w:bottom w:val="single" w:sz="1" w:space="0" w:color="000000"/>
+              <w:left w:val="single" w:sz="1" w:space="0" w:color="000000"/>
+              <w:right w:val="single" w:sz="1" w:space="0" w:color="000000"/>
+            </w:tcBorders>
+          </w:tcPr>
+          <w:p>
+            <w:pPr>
+              <w:spacing w:lineRule="auto"/>
+            </w:pPr>
+            <w:r>
+              <w:rPr/>
+              <w:t xml:space="preserve">Motivos y multas por rol</w:t>
+            </w:r>
+          </w:p>
+        </w:tc>
+      </w:tr>
+      <w:tr>
+        <w:trPr/>
+        <w:tc>
+          <w:tcPr>
+            <w:tcBorders>
+              <w:top w:val="single" w:sz="1" w:space="0" w:color="000000"/>
+              <w:bottom w:val="single" w:sz="1" w:space="0" w:color="000000"/>
+              <w:left w:val="single" w:sz="1" w:space="0" w:color="000000"/>
+              <w:right w:val="single" w:sz="1" w:space="0" w:color="000000"/>
+            </w:tcBorders>
+          </w:tcPr>
+          <w:p>
+            <w:pPr>
+              <w:spacing w:lineRule="auto"/>
+            </w:pPr>
+            <w:r>
+              <w:rPr/>
+              <w:t xml:space="preserve">GET/POST</w:t>
+            </w:r>
+          </w:p>
+        </w:tc>
+        <w:tc>
+          <w:tcPr>
+            <w:tcBorders>
+              <w:top w:val="single" w:sz="1" w:space="0" w:color="000000"/>
+              <w:bottom w:val="single" w:sz="1" w:space="0" w:color="000000"/>
+              <w:left w:val="single" w:sz="1" w:space="0" w:color="000000"/>
+              <w:right w:val="single" w:sz="1" w:space="0" w:color="000000"/>
+            </w:tcBorders>
+          </w:tcPr>
+          <w:p>
+            <w:pPr>
+              <w:spacing w:lineRule="auto"/>
+            </w:pPr>
+            <w:r>
+              <w:rPr/>
+              <w:t xml:space="preserve">/api/comms/…</w:t>
+            </w:r>
+          </w:p>
+        </w:tc>
+        <w:tc>
+          <w:tcPr>
+            <w:tcBorders>
+              <w:top w:val="single" w:sz="1" w:space="0" w:color="000000"/>
+              <w:bottom w:val="single" w:sz="1" w:space="0" w:color="000000"/>
+              <w:left w:val="single" w:sz="1" w:space="0" w:color="000000"/>
+              <w:right w:val="single" w:sz="1" w:space="0" w:color="000000"/>
+            </w:tcBorders>
+          </w:tcPr>
+          <w:p>
+            <w:pPr>
+              <w:spacing w:lineRule="auto"/>
+            </w:pPr>
+            <w:r>
+              <w:rPr/>
+              <w:t xml:space="preserve">Chat y notificaciones</w:t>
+            </w:r>
+          </w:p>
+        </w:tc>
+      </w:tr>
+      <w:tr>
+        <w:trPr/>
+        <w:tc>
+          <w:tcPr>
+            <w:tcBorders>
+              <w:top w:val="single" w:sz="1" w:space="0" w:color="000000"/>
+              <w:bottom w:val="single" w:sz="1" w:space="0" w:color="000000"/>
+              <w:left w:val="single" w:sz="1" w:space="0" w:color="000000"/>
+              <w:right w:val="single" w:sz="1" w:space="0" w:color="000000"/>
+            </w:tcBorders>
+          </w:tcPr>
+          <w:p>
+            <w:pPr>
+              <w:spacing w:lineRule="auto"/>
+            </w:pPr>
+            <w:r>
+              <w:rPr/>
+              <w:t xml:space="preserve">GET</w:t>
+            </w:r>
+          </w:p>
+        </w:tc>
+        <w:tc>
+          <w:tcPr>
+            <w:tcBorders>
+              <w:top w:val="single" w:sz="1" w:space="0" w:color="000000"/>
+              <w:bottom w:val="single" w:sz="1" w:space="0" w:color="000000"/>
+              <w:left w:val="single" w:sz="1" w:space="0" w:color="000000"/>
+              <w:right w:val="single" w:sz="1" w:space="0" w:color="000000"/>
+            </w:tcBorders>
+          </w:tcPr>
+          <w:p>
+            <w:pPr>
+              <w:spacing w:lineRule="auto"/>
+            </w:pPr>
+            <w:r>
+              <w:rPr/>
+              <w:t xml:space="preserve">/api/account/summary</w:t>
+            </w:r>
+          </w:p>
+        </w:tc>
+        <w:tc>
+          <w:tcPr>
+            <w:tcBorders>
+              <w:top w:val="single" w:sz="1" w:space="0" w:color="000000"/>
+              <w:bottom w:val="single" w:sz="1" w:space="0" w:color="000000"/>
+              <w:left w:val="single" w:sz="1" w:space="0" w:color="000000"/>
+              <w:right w:val="single" w:sz="1" w:space="0" w:color="000000"/>
+            </w:tcBorders>
+          </w:tcPr>
+          <w:p>
+            <w:pPr>
+              <w:spacing w:lineRule="auto"/>
+            </w:pPr>
+            <w:r>
+              <w:rPr/>
+              <w:t xml:space="preserve">Multas pendientes, plazos</w:t>
+            </w:r>
+          </w:p>
+        </w:tc>
+      </w:tr>
+      <w:tr>
+        <w:trPr/>
+        <w:tc>
+          <w:tcPr>
+            <w:tcBorders>
+              <w:top w:val="single" w:sz="1" w:space="0" w:color="000000"/>
+              <w:bottom w:val="single" w:sz="1" w:space="0" w:color="000000"/>
+              <w:left w:val="single" w:sz="1" w:space="0" w:color="000000"/>
+              <w:right w:val="single" w:sz="1" w:space="0" w:color="000000"/>
+            </w:tcBorders>
+          </w:tcPr>
+          <w:p>
+            <w:pPr>
+              <w:spacing w:lineRule="auto"/>
+            </w:pPr>
+            <w:r>
+              <w:rPr/>
+              <w:t xml:space="preserve">PATCH</w:t>
+            </w:r>
+          </w:p>
+        </w:tc>
+        <w:tc>
+          <w:tcPr>
+            <w:tcBorders>
+              <w:top w:val="single" w:sz="1" w:space="0" w:color="000000"/>
+              <w:bottom w:val="single" w:sz="1" w:space="0" w:color="000000"/>
+              <w:left w:val="single" w:sz="1" w:space="0" w:color="000000"/>
+              <w:right w:val="single" w:sz="1" w:space="0" w:color="000000"/>
+            </w:tcBorders>
+          </w:tcPr>
+          <w:p>
+            <w:pPr>
+              <w:spacing w:lineRule="auto"/>
+            </w:pPr>
+            <w:r>
+              <w:rPr/>
+              <w:t xml:space="preserve">/api/account/bank</w:t>
+            </w:r>
+          </w:p>
+        </w:tc>
+        <w:tc>
+          <w:tcPr>
+            <w:tcBorders>
+              <w:top w:val="single" w:sz="1" w:space="0" w:color="000000"/>
+              <w:bottom w:val="single" w:sz="1" w:space="0" w:color="000000"/>
+              <w:left w:val="single" w:sz="1" w:space="0" w:color="000000"/>
+              <w:right w:val="single" w:sz="1" w:space="0" w:color="000000"/>
+            </w:tcBorders>
+          </w:tcPr>
+          <w:p>
+            <w:pPr>
+              <w:spacing w:lineRule="auto"/>
+            </w:pPr>
+            <w:r>
+              <w:rPr/>
+              <w:t xml:space="preserve">Cuenta bancaria</w:t>
+            </w:r>
+          </w:p>
+        </w:tc>
+      </w:tr>
+    </w:tbl>
+    <w:p>
+      <w:pPr>
+        <w:spacing w:lineRule="auto"/>
+      </w:pPr>
+      <w:r>
+        <w:rPr/>
+      </w:r>
+    </w:p>
+    <w:p>
+      <w:pPr>
+        <w:spacing w:lineRule="auto"/>
+      </w:pPr>
+      <w:r>
+        <w:rPr/>
+        <w:t xml:space="preserve">Fin del documento — v2.1: Parte I Gantt coloreado, hub /docs/, alineación Chanchi.</w:t>
       </w:r>
     </w:p>
   </w:body>

</xml_diff>

<commit_message>
docs: export memoria v0.0.106
Co-authored-by: Cursor <cursoragent@cursor.com>
</commit_message>
<xml_diff>
--- a/docs/Memoria-tecnica-Uber-Truck.docx
+++ b/docs/Memoria-tecnica-Uber-Truck.docx
@@ -75,7 +75,7 @@
       </w:r>
       <w:r>
         <w:rPr/>
-        <w:t xml:space="preserve"> 0.0.105 (Cubik app móvil + API Railway)  |  </w:t>
+        <w:t xml:space="preserve"> 0.0.106 (Cubik app móvil + API Railway)  |  </w:t>
       </w:r>
       <w:r>
         <w:rPr>
@@ -22385,7 +22385,15 @@
       </w:r>
       <w:r>
         <w:rPr/>
-        <w:t xml:space="preserve"> v0.0.105 · Railway </w:t>
+        <w:t xml:space="preserve"> commit </w:t>
+      </w:r>
+      <w:r>
+        <w:rPr/>
+        <w:t xml:space="preserve">a4336d7</w:t>
+      </w:r>
+      <w:r>
+        <w:rPr/>
+        <w:t xml:space="preserve"> (v0.0.105) · Railway </w:t>
       </w:r>
       <w:r>
         <w:rPr/>
@@ -22394,6 +22402,302 @@
       <w:r>
         <w:rPr/>
         <w:t xml:space="preserve"> · comisiones piloto sin cambio.</w:t>
+      </w:r>
+    </w:p>
+    <w:p>
+      <w:pPr>
+        <w:pStyle w:val="Heading2"/>
+        <w:spacing w:lineRule="auto"/>
+      </w:pPr>
+      <w:r>
+        <w:rPr/>
+        <w:t xml:space="preserve">Bitácora de avance — 25 mayo 2026 (v0.0.106 — UX urgencia y emparejar)</w:t>
+      </w:r>
+    </w:p>
+    <w:tbl>
+      <w:tblPr>
+        <w:tblBorders>
+          <w:top w:val="single" w:sz="2" w:space="0" w:color="000000"/>
+          <w:bottom w:val="single" w:sz="2" w:space="0" w:color="000000"/>
+          <w:left w:val="single" w:sz="2" w:space="0" w:color="000000"/>
+          <w:right w:val="single" w:sz="2" w:space="0" w:color="000000"/>
+        </w:tblBorders>
+        <w:tblCellSpacing w:w="0" w:type="dxa"/>
+        <w:tblCellMar>
+          <w:top w:type="dxa" w:w="80"/>
+          <w:bottom w:type="dxa" w:w="80"/>
+          <w:left w:type="dxa" w:w="160"/>
+          <w:right w:type="dxa" w:w="160"/>
+        </w:tblCellMar>
+        <w:jc w:val="center"/>
+      </w:tblPr>
+      <w:tblGrid>
+        <w:gridCol w:w="2880"/>
+        <w:gridCol w:w="2880"/>
+        <w:gridCol w:w="2880"/>
+      </w:tblGrid>
+      <w:tr>
+        <w:trPr/>
+        <w:tc>
+          <w:tcPr>
+            <w:tcBorders>
+              <w:top w:val="single" w:sz="1" w:space="0" w:color="000000"/>
+              <w:bottom w:val="single" w:sz="1" w:space="0" w:color="000000"/>
+              <w:left w:val="single" w:sz="1" w:space="0" w:color="000000"/>
+              <w:right w:val="single" w:sz="1" w:space="0" w:color="000000"/>
+            </w:tcBorders>
+          </w:tcPr>
+          <w:p>
+            <w:pPr>
+              <w:spacing w:lineRule="auto"/>
+            </w:pPr>
+            <w:r>
+              <w:rPr/>
+              <w:t xml:space="preserve">Área</w:t>
+            </w:r>
+          </w:p>
+        </w:tc>
+        <w:tc>
+          <w:tcPr>
+            <w:tcBorders>
+              <w:top w:val="single" w:sz="1" w:space="0" w:color="000000"/>
+              <w:bottom w:val="single" w:sz="1" w:space="0" w:color="000000"/>
+              <w:left w:val="single" w:sz="1" w:space="0" w:color="000000"/>
+              <w:right w:val="single" w:sz="1" w:space="0" w:color="000000"/>
+            </w:tcBorders>
+          </w:tcPr>
+          <w:p>
+            <w:pPr>
+              <w:spacing w:lineRule="auto"/>
+            </w:pPr>
+            <w:r>
+              <w:rPr/>
+              <w:t xml:space="preserve">Entregado</w:t>
+            </w:r>
+          </w:p>
+        </w:tc>
+        <w:tc>
+          <w:tcPr>
+            <w:tcBorders>
+              <w:top w:val="single" w:sz="1" w:space="0" w:color="000000"/>
+              <w:bottom w:val="single" w:sz="1" w:space="0" w:color="000000"/>
+              <w:left w:val="single" w:sz="1" w:space="0" w:color="000000"/>
+              <w:right w:val="single" w:sz="1" w:space="0" w:color="000000"/>
+            </w:tcBorders>
+          </w:tcPr>
+          <w:p>
+            <w:pPr>
+              <w:spacing w:lineRule="auto"/>
+            </w:pPr>
+            <w:r>
+              <w:rPr/>
+              <w:t xml:space="preserve">Notas</w:t>
+            </w:r>
+          </w:p>
+        </w:tc>
+      </w:tr>
+      <w:tr>
+        <w:trPr/>
+        <w:tc>
+          <w:tcPr>
+            <w:tcBorders>
+              <w:top w:val="single" w:sz="1" w:space="0" w:color="000000"/>
+              <w:bottom w:val="single" w:sz="1" w:space="0" w:color="000000"/>
+              <w:left w:val="single" w:sz="1" w:space="0" w:color="000000"/>
+              <w:right w:val="single" w:sz="1" w:space="0" w:color="000000"/>
+            </w:tcBorders>
+          </w:tcPr>
+          <w:p>
+            <w:pPr>
+              <w:spacing w:lineRule="auto"/>
+            </w:pPr>
+            <w:r>
+              <w:rPr/>
+              <w:t xml:space="preserve">Urgencia al publicar</w:t>
+            </w:r>
+          </w:p>
+        </w:tc>
+        <w:tc>
+          <w:tcPr>
+            <w:tcBorders>
+              <w:top w:val="single" w:sz="1" w:space="0" w:color="000000"/>
+              <w:bottom w:val="single" w:sz="1" w:space="0" w:color="000000"/>
+              <w:left w:val="single" w:sz="1" w:space="0" w:color="000000"/>
+              <w:right w:val="single" w:sz="1" w:space="0" w:color="000000"/>
+            </w:tcBorders>
+          </w:tcPr>
+          <w:p>
+            <w:pPr>
+              <w:spacing w:lineRule="auto"/>
+            </w:pPr>
+            <w:r>
+              <w:rPr/>
+              <w:t xml:space="preserve">Mensaje dinámico Normal / Urgente / Flexible (copy comercial, piloto honesto)</w:t>
+            </w:r>
+          </w:p>
+        </w:tc>
+        <w:tc>
+          <w:tcPr>
+            <w:tcBorders>
+              <w:top w:val="single" w:sz="1" w:space="0" w:color="000000"/>
+              <w:bottom w:val="single" w:sz="1" w:space="0" w:color="000000"/>
+              <w:left w:val="single" w:sz="1" w:space="0" w:color="000000"/>
+              <w:right w:val="single" w:sz="1" w:space="0" w:color="000000"/>
+            </w:tcBorders>
+          </w:tcPr>
+          <w:p>
+            <w:pPr>
+              <w:spacing w:lineRule="auto"/>
+            </w:pPr>
+            <w:r>
+              <w:rPr>
+                <w:highlight w:val="lightGray"/>
+              </w:rPr>
+              <w:t xml:space="preserve">load-budget-ui.js</w:t>
+            </w:r>
+          </w:p>
+        </w:tc>
+      </w:tr>
+      <w:tr>
+        <w:trPr/>
+        <w:tc>
+          <w:tcPr>
+            <w:tcBorders>
+              <w:top w:val="single" w:sz="1" w:space="0" w:color="000000"/>
+              <w:bottom w:val="single" w:sz="1" w:space="0" w:color="000000"/>
+              <w:left w:val="single" w:sz="1" w:space="0" w:color="000000"/>
+              <w:right w:val="single" w:sz="1" w:space="0" w:color="000000"/>
+            </w:tcBorders>
+          </w:tcPr>
+          <w:p>
+            <w:pPr>
+              <w:spacing w:lineRule="auto"/>
+            </w:pPr>
+            <w:r>
+              <w:rPr/>
+              <w:t xml:space="preserve">Sugerencias automáticas</w:t>
+            </w:r>
+          </w:p>
+        </w:tc>
+        <w:tc>
+          <w:tcPr>
+            <w:tcBorders>
+              <w:top w:val="single" w:sz="1" w:space="0" w:color="000000"/>
+              <w:bottom w:val="single" w:sz="1" w:space="0" w:color="000000"/>
+              <w:left w:val="single" w:sz="1" w:space="0" w:color="000000"/>
+              <w:right w:val="single" w:sz="1" w:space="0" w:color="000000"/>
+            </w:tcBorders>
+          </w:tcPr>
+          <w:p>
+            <w:pPr>
+              <w:spacing w:lineRule="auto"/>
+            </w:pPr>
+            <w:r>
+              <w:rPr/>
+              <w:t xml:space="preserve">«Usar en Paso 2» vs «Crear propuesta ya» + texto explicativo</w:t>
+            </w:r>
+          </w:p>
+        </w:tc>
+        <w:tc>
+          <w:tcPr>
+            <w:tcBorders>
+              <w:top w:val="single" w:sz="1" w:space="0" w:color="000000"/>
+              <w:bottom w:val="single" w:sz="1" w:space="0" w:color="000000"/>
+              <w:left w:val="single" w:sz="1" w:space="0" w:color="000000"/>
+              <w:right w:val="single" w:sz="1" w:space="0" w:color="000000"/>
+            </w:tcBorders>
+          </w:tcPr>
+          <w:p>
+            <w:pPr>
+              <w:spacing w:lineRule="auto"/>
+            </w:pPr>
+            <w:r>
+              <w:rPr>
+                <w:highlight w:val="lightGray"/>
+              </w:rPr>
+              <w:t xml:space="preserve">app.js</w:t>
+            </w:r>
+          </w:p>
+        </w:tc>
+      </w:tr>
+      <w:tr>
+        <w:trPr/>
+        <w:tc>
+          <w:tcPr>
+            <w:tcBorders>
+              <w:top w:val="single" w:sz="1" w:space="0" w:color="000000"/>
+              <w:bottom w:val="single" w:sz="1" w:space="0" w:color="000000"/>
+              <w:left w:val="single" w:sz="1" w:space="0" w:color="000000"/>
+              <w:right w:val="single" w:sz="1" w:space="0" w:color="000000"/>
+            </w:tcBorders>
+          </w:tcPr>
+          <w:p>
+            <w:pPr>
+              <w:spacing w:lineRule="auto"/>
+            </w:pPr>
+            <w:r>
+              <w:rPr/>
+              <w:t xml:space="preserve">Oferta transportista</w:t>
+            </w:r>
+          </w:p>
+        </w:tc>
+        <w:tc>
+          <w:tcPr>
+            <w:tcBorders>
+              <w:top w:val="single" w:sz="1" w:space="0" w:color="000000"/>
+              <w:bottom w:val="single" w:sz="1" w:space="0" w:color="000000"/>
+              <w:left w:val="single" w:sz="1" w:space="0" w:color="000000"/>
+              <w:right w:val="single" w:sz="1" w:space="0" w:color="000000"/>
+            </w:tcBorders>
+          </w:tcPr>
+          <w:p>
+            <w:pPr>
+              <w:spacing w:lineRule="auto"/>
+            </w:pPr>
+            <w:r>
+              <w:rPr/>
+              <w:t xml:space="preserve">Botón grande «Enviar propuesta» en emparejamientos activos</w:t>
+            </w:r>
+          </w:p>
+        </w:tc>
+        <w:tc>
+          <w:tcPr>
+            <w:tcBorders>
+              <w:top w:val="single" w:sz="1" w:space="0" w:color="000000"/>
+              <w:bottom w:val="single" w:sz="1" w:space="0" w:color="000000"/>
+              <w:left w:val="single" w:sz="1" w:space="0" w:color="000000"/>
+              <w:right w:val="single" w:sz="1" w:space="0" w:color="000000"/>
+            </w:tcBorders>
+          </w:tcPr>
+          <w:p>
+            <w:pPr>
+              <w:spacing w:lineRule="auto"/>
+            </w:pPr>
+            <w:r>
+              <w:rPr>
+                <w:highlight w:val="lightGray"/>
+              </w:rPr>
+              <w:t xml:space="preserve">theme.css</w:t>
+            </w:r>
+          </w:p>
+          <w:p>
+            <w:pPr>
+              <w:spacing w:lineRule="auto"/>
+            </w:pPr>
+            <w:r>
+              <w:rPr/>
+              <w:t xml:space="preserve">, input ancho</w:t>
+            </w:r>
+          </w:p>
+        </w:tc>
+      </w:tr>
+    </w:tbl>
+    <w:p>
+      <w:pPr>
+        <w:spacing w:lineRule="auto"/>
+      </w:pPr>
+      <w:r>
+        <w:rPr/>
       </w:r>
     </w:p>
     <w:p>

</xml_diff>